<commit_message>
Merge README and reports from main
</commit_message>
<xml_diff>
--- a/docs/Report-1_Project Introduction.docx
+++ b/docs/Report-1_Project Introduction.docx
@@ -358,7 +358,6 @@
         <w:ind w:left="0" w:right="0" w:firstLine="0"/>
         <w:jc w:val="left"/>
         <w:rPr>
-          <w:rFonts w:ascii="Calibri" w:cs="Calibri" w:eastAsia="Calibri" w:hAnsi="Calibri"/>
           <w:b w:val="1"/>
           <w:bCs w:val="1"/>
           <w:i w:val="0"/>
@@ -375,7 +374,6 @@
       </w:pPr>
       <w:r>
         <w:rPr>
-          <w:rFonts w:ascii="Calibri" w:cs="Calibri" w:eastAsia="Calibri" w:hAnsi="Calibri"/>
           <w:b w:val="1"/>
           <w:bCs w:val="1"/>
           <w:i w:val="0"/>
@@ -395,7 +393,7 @@
     </w:p>
     <w:sdt>
       <w:sdtPr>
-        <w:id w:val="-1927111697"/>
+        <w:id w:val="-1900626484"/>
         <w:docPartObj>
           <w:docPartGallery w:val="Table of Contents"/>
           <w:docPartUnique w:val="1"/>
@@ -410,7 +408,6 @@
             </w:tabs>
             <w:spacing w:after="0" w:before="60" w:line="240" w:lineRule="auto"/>
             <w:rPr>
-              <w:rFonts w:ascii="Arial" w:cs="Arial" w:eastAsia="Arial" w:hAnsi="Arial"/>
               <w:b w:val="1"/>
               <w:bCs w:val="1"/>
               <w:i w:val="0"/>
@@ -433,7 +430,6 @@
           <w:hyperlink w:anchor="_heading=h.mxjx1149npg0">
             <w:r>
               <w:rPr>
-                <w:rFonts w:ascii="Calibri" w:cs="Calibri" w:eastAsia="Calibri" w:hAnsi="Calibri"/>
                 <w:b w:val="1"/>
                 <w:bCs w:val="1"/>
                 <w:i w:val="0"/>
@@ -467,7 +463,6 @@
             </w:tabs>
             <w:spacing w:after="0" w:before="60" w:line="240" w:lineRule="auto"/>
             <w:rPr>
-              <w:rFonts w:ascii="Arial" w:cs="Arial" w:eastAsia="Arial" w:hAnsi="Arial"/>
               <w:b w:val="1"/>
               <w:bCs w:val="1"/>
               <w:i w:val="0"/>
@@ -485,7 +480,6 @@
           <w:hyperlink w:anchor="_heading=h.k3xx35f7zflp">
             <w:r>
               <w:rPr>
-                <w:rFonts w:ascii="Calibri" w:cs="Calibri" w:eastAsia="Calibri" w:hAnsi="Calibri"/>
                 <w:b w:val="1"/>
                 <w:bCs w:val="1"/>
                 <w:i w:val="0"/>
@@ -520,9 +514,6 @@
             <w:spacing w:after="0" w:before="60" w:line="240" w:lineRule="auto"/>
             <w:ind w:left="360" w:firstLine="0"/>
             <w:rPr>
-              <w:rFonts w:ascii="Arial" w:cs="Arial" w:eastAsia="Arial" w:hAnsi="Arial"/>
-              <w:b w:val="0"/>
-              <w:bCs w:val="0"/>
               <w:i w:val="0"/>
               <w:iCs w:val="0"/>
               <w:smallCaps w:val="0"/>
@@ -538,9 +529,6 @@
           <w:hyperlink w:anchor="_heading=h.stp6gm7bycoj">
             <w:r>
               <w:rPr>
-                <w:rFonts w:ascii="Calibri" w:cs="Calibri" w:eastAsia="Calibri" w:hAnsi="Calibri"/>
-                <w:b w:val="0"/>
-                <w:bCs w:val="0"/>
                 <w:i w:val="0"/>
                 <w:iCs w:val="0"/>
                 <w:smallCaps w:val="0"/>
@@ -573,9 +561,6 @@
             <w:spacing w:after="0" w:before="60" w:line="240" w:lineRule="auto"/>
             <w:ind w:left="360" w:firstLine="0"/>
             <w:rPr>
-              <w:rFonts w:ascii="Arial" w:cs="Arial" w:eastAsia="Arial" w:hAnsi="Arial"/>
-              <w:b w:val="0"/>
-              <w:bCs w:val="0"/>
               <w:i w:val="0"/>
               <w:iCs w:val="0"/>
               <w:smallCaps w:val="0"/>
@@ -591,9 +576,6 @@
           <w:hyperlink w:anchor="_heading=h.mf4hdjjc9oh7">
             <w:r>
               <w:rPr>
-                <w:rFonts w:ascii="Calibri" w:cs="Calibri" w:eastAsia="Calibri" w:hAnsi="Calibri"/>
-                <w:b w:val="0"/>
-                <w:bCs w:val="0"/>
                 <w:i w:val="0"/>
                 <w:iCs w:val="0"/>
                 <w:smallCaps w:val="0"/>
@@ -626,9 +608,6 @@
             <w:spacing w:after="0" w:before="60" w:line="240" w:lineRule="auto"/>
             <w:ind w:left="360" w:firstLine="0"/>
             <w:rPr>
-              <w:rFonts w:ascii="Arial" w:cs="Arial" w:eastAsia="Arial" w:hAnsi="Arial"/>
-              <w:b w:val="0"/>
-              <w:bCs w:val="0"/>
               <w:i w:val="0"/>
               <w:iCs w:val="0"/>
               <w:smallCaps w:val="0"/>
@@ -644,9 +623,6 @@
           <w:hyperlink w:anchor="_heading=h.rfvpnkcjpn7s">
             <w:r>
               <w:rPr>
-                <w:rFonts w:ascii="Calibri" w:cs="Calibri" w:eastAsia="Calibri" w:hAnsi="Calibri"/>
-                <w:b w:val="0"/>
-                <w:bCs w:val="0"/>
                 <w:i w:val="0"/>
                 <w:iCs w:val="0"/>
                 <w:smallCaps w:val="0"/>
@@ -678,7 +654,6 @@
             </w:tabs>
             <w:spacing w:after="0" w:before="60" w:line="240" w:lineRule="auto"/>
             <w:rPr>
-              <w:rFonts w:ascii="Arial" w:cs="Arial" w:eastAsia="Arial" w:hAnsi="Arial"/>
               <w:b w:val="1"/>
               <w:bCs w:val="1"/>
               <w:i w:val="0"/>
@@ -696,7 +671,6 @@
           <w:hyperlink w:anchor="_heading=h.srx7tqv73n96">
             <w:r>
               <w:rPr>
-                <w:rFonts w:ascii="Calibri" w:cs="Calibri" w:eastAsia="Calibri" w:hAnsi="Calibri"/>
                 <w:b w:val="1"/>
                 <w:bCs w:val="1"/>
                 <w:i w:val="0"/>
@@ -730,7 +704,6 @@
             </w:tabs>
             <w:spacing w:after="0" w:before="60" w:line="240" w:lineRule="auto"/>
             <w:rPr>
-              <w:rFonts w:ascii="Arial" w:cs="Arial" w:eastAsia="Arial" w:hAnsi="Arial"/>
               <w:b w:val="1"/>
               <w:bCs w:val="1"/>
               <w:i w:val="0"/>
@@ -748,7 +721,6 @@
           <w:hyperlink w:anchor="_heading=h.7bas0rhkntbp">
             <w:r>
               <w:rPr>
-                <w:rFonts w:ascii="Calibri" w:cs="Calibri" w:eastAsia="Calibri" w:hAnsi="Calibri"/>
                 <w:b w:val="1"/>
                 <w:bCs w:val="1"/>
                 <w:i w:val="0"/>
@@ -783,9 +755,6 @@
             <w:spacing w:after="0" w:before="60" w:line="240" w:lineRule="auto"/>
             <w:ind w:left="360" w:firstLine="0"/>
             <w:rPr>
-              <w:rFonts w:ascii="Arial" w:cs="Arial" w:eastAsia="Arial" w:hAnsi="Arial"/>
-              <w:b w:val="0"/>
-              <w:bCs w:val="0"/>
               <w:i w:val="0"/>
               <w:iCs w:val="0"/>
               <w:smallCaps w:val="0"/>
@@ -801,9 +770,6 @@
           <w:hyperlink w:anchor="_heading=h.90alr6skzyxb">
             <w:r>
               <w:rPr>
-                <w:rFonts w:ascii="Calibri" w:cs="Calibri" w:eastAsia="Calibri" w:hAnsi="Calibri"/>
-                <w:b w:val="0"/>
-                <w:bCs w:val="0"/>
                 <w:i w:val="0"/>
                 <w:iCs w:val="0"/>
                 <w:smallCaps w:val="0"/>
@@ -836,9 +802,6 @@
             <w:spacing w:after="0" w:before="60" w:line="240" w:lineRule="auto"/>
             <w:ind w:left="360" w:firstLine="0"/>
             <w:rPr>
-              <w:rFonts w:ascii="Arial" w:cs="Arial" w:eastAsia="Arial" w:hAnsi="Arial"/>
-              <w:b w:val="0"/>
-              <w:bCs w:val="0"/>
               <w:i w:val="0"/>
               <w:iCs w:val="0"/>
               <w:smallCaps w:val="0"/>
@@ -854,9 +817,6 @@
           <w:hyperlink w:anchor="_heading=h.f8qpyr3aqker">
             <w:r>
               <w:rPr>
-                <w:rFonts w:ascii="Calibri" w:cs="Calibri" w:eastAsia="Calibri" w:hAnsi="Calibri"/>
-                <w:b w:val="0"/>
-                <w:bCs w:val="0"/>
                 <w:i w:val="0"/>
                 <w:iCs w:val="0"/>
                 <w:smallCaps w:val="0"/>
@@ -889,9 +849,6 @@
             <w:spacing w:after="0" w:before="60" w:line="240" w:lineRule="auto"/>
             <w:ind w:left="360" w:firstLine="0"/>
             <w:rPr>
-              <w:rFonts w:ascii="Arial" w:cs="Arial" w:eastAsia="Arial" w:hAnsi="Arial"/>
-              <w:b w:val="0"/>
-              <w:bCs w:val="0"/>
               <w:i w:val="0"/>
               <w:iCs w:val="0"/>
               <w:smallCaps w:val="0"/>
@@ -907,9 +864,6 @@
           <w:hyperlink w:anchor="_heading=h.roe9tzve6rkd">
             <w:r>
               <w:rPr>
-                <w:rFonts w:ascii="Arial" w:cs="Arial" w:eastAsia="Arial" w:hAnsi="Arial"/>
-                <w:b w:val="0"/>
-                <w:bCs w:val="0"/>
                 <w:i w:val="0"/>
                 <w:iCs w:val="0"/>
                 <w:smallCaps w:val="0"/>
@@ -942,9 +896,6 @@
             <w:spacing w:after="0" w:before="60" w:line="240" w:lineRule="auto"/>
             <w:ind w:left="360" w:firstLine="0"/>
             <w:rPr>
-              <w:rFonts w:ascii="Arial" w:cs="Arial" w:eastAsia="Arial" w:hAnsi="Arial"/>
-              <w:b w:val="0"/>
-              <w:bCs w:val="0"/>
               <w:i w:val="0"/>
               <w:iCs w:val="0"/>
               <w:smallCaps w:val="0"/>
@@ -960,9 +911,6 @@
           <w:hyperlink w:anchor="_heading=h.3nmz7wiremfs">
             <w:r>
               <w:rPr>
-                <w:rFonts w:ascii="Arial" w:cs="Arial" w:eastAsia="Arial" w:hAnsi="Arial"/>
-                <w:b w:val="0"/>
-                <w:bCs w:val="0"/>
                 <w:i w:val="0"/>
                 <w:iCs w:val="0"/>
                 <w:smallCaps w:val="0"/>
@@ -995,9 +943,6 @@
             <w:spacing w:after="0" w:before="60" w:line="240" w:lineRule="auto"/>
             <w:ind w:left="360" w:firstLine="0"/>
             <w:rPr>
-              <w:rFonts w:ascii="Arial" w:cs="Arial" w:eastAsia="Arial" w:hAnsi="Arial"/>
-              <w:b w:val="0"/>
-              <w:bCs w:val="0"/>
               <w:i w:val="0"/>
               <w:iCs w:val="0"/>
               <w:smallCaps w:val="0"/>
@@ -1013,9 +958,6 @@
           <w:hyperlink w:anchor="_heading=h.q77f3ypkkuu">
             <w:r>
               <w:rPr>
-                <w:rFonts w:ascii="Calibri" w:cs="Calibri" w:eastAsia="Calibri" w:hAnsi="Calibri"/>
-                <w:b w:val="0"/>
-                <w:bCs w:val="0"/>
                 <w:i w:val="0"/>
                 <w:iCs w:val="0"/>
                 <w:smallCaps w:val="0"/>
@@ -1047,7 +989,6 @@
             </w:tabs>
             <w:spacing w:after="0" w:before="60" w:line="240" w:lineRule="auto"/>
             <w:rPr>
-              <w:rFonts w:ascii="Arial" w:cs="Arial" w:eastAsia="Arial" w:hAnsi="Arial"/>
               <w:b w:val="1"/>
               <w:bCs w:val="1"/>
               <w:i w:val="0"/>
@@ -1065,7 +1006,6 @@
           <w:hyperlink w:anchor="_heading=h.2hm3ynq0t550">
             <w:r>
               <w:rPr>
-                <w:rFonts w:ascii="Calibri" w:cs="Calibri" w:eastAsia="Calibri" w:hAnsi="Calibri"/>
                 <w:b w:val="1"/>
                 <w:bCs w:val="1"/>
                 <w:i w:val="0"/>
@@ -1099,7 +1039,6 @@
             </w:tabs>
             <w:spacing w:after="0" w:before="60" w:line="240" w:lineRule="auto"/>
             <w:rPr>
-              <w:rFonts w:ascii="Arial" w:cs="Arial" w:eastAsia="Arial" w:hAnsi="Arial"/>
               <w:b w:val="1"/>
               <w:bCs w:val="1"/>
               <w:i w:val="0"/>
@@ -1117,7 +1056,6 @@
           <w:hyperlink w:anchor="_heading=h.fzfk4otewcr4">
             <w:r>
               <w:rPr>
-                <w:rFonts w:ascii="Calibri" w:cs="Calibri" w:eastAsia="Calibri" w:hAnsi="Calibri"/>
                 <w:b w:val="1"/>
                 <w:bCs w:val="1"/>
                 <w:i w:val="0"/>
@@ -1152,9 +1090,6 @@
             <w:spacing w:after="0" w:before="60" w:line="240" w:lineRule="auto"/>
             <w:ind w:left="360" w:firstLine="0"/>
             <w:rPr>
-              <w:rFonts w:ascii="Arial" w:cs="Arial" w:eastAsia="Arial" w:hAnsi="Arial"/>
-              <w:b w:val="0"/>
-              <w:bCs w:val="0"/>
               <w:i w:val="0"/>
               <w:iCs w:val="0"/>
               <w:smallCaps w:val="0"/>
@@ -1170,9 +1105,6 @@
           <w:hyperlink w:anchor="_heading=h.13jbrax1dlg8">
             <w:r>
               <w:rPr>
-                <w:rFonts w:ascii="Calibri" w:cs="Calibri" w:eastAsia="Calibri" w:hAnsi="Calibri"/>
-                <w:b w:val="0"/>
-                <w:bCs w:val="0"/>
                 <w:i w:val="0"/>
                 <w:iCs w:val="0"/>
                 <w:smallCaps w:val="0"/>
@@ -1205,9 +1137,6 @@
             <w:spacing w:after="0" w:before="60" w:line="240" w:lineRule="auto"/>
             <w:ind w:left="360" w:firstLine="0"/>
             <w:rPr>
-              <w:rFonts w:ascii="Arial" w:cs="Arial" w:eastAsia="Arial" w:hAnsi="Arial"/>
-              <w:b w:val="0"/>
-              <w:bCs w:val="0"/>
               <w:i w:val="0"/>
               <w:iCs w:val="0"/>
               <w:smallCaps w:val="0"/>
@@ -1223,9 +1152,6 @@
           <w:hyperlink w:anchor="_heading=h.abf702ut2f2p">
             <w:r>
               <w:rPr>
-                <w:rFonts w:ascii="Calibri" w:cs="Calibri" w:eastAsia="Calibri" w:hAnsi="Calibri"/>
-                <w:b w:val="0"/>
-                <w:bCs w:val="0"/>
                 <w:i w:val="0"/>
                 <w:iCs w:val="0"/>
                 <w:smallCaps w:val="0"/>
@@ -1257,7 +1183,6 @@
             </w:tabs>
             <w:spacing w:after="0" w:before="60" w:line="240" w:lineRule="auto"/>
             <w:rPr>
-              <w:rFonts w:ascii="Arial" w:cs="Arial" w:eastAsia="Arial" w:hAnsi="Arial"/>
               <w:b w:val="1"/>
               <w:bCs w:val="1"/>
               <w:i w:val="0"/>
@@ -1275,7 +1200,6 @@
           <w:hyperlink w:anchor="_heading=h.q2vj5nuojq0e">
             <w:r>
               <w:rPr>
-                <w:rFonts w:ascii="Calibri" w:cs="Calibri" w:eastAsia="Calibri" w:hAnsi="Calibri"/>
                 <w:b w:val="1"/>
                 <w:bCs w:val="1"/>
                 <w:i w:val="0"/>
@@ -1309,7 +1233,6 @@
     <w:p>
       <w:pPr>
         <w:rPr>
-          <w:rFonts w:ascii="Calibri" w:cs="Calibri" w:eastAsia="Calibri" w:hAnsi="Calibri"/>
           <w:b w:val="1"/>
           <w:bCs w:val="1"/>
           <w:color w:val="c00000"/>
@@ -1397,7 +1320,6 @@
               <w:ind w:left="0" w:right="0" w:firstLine="0"/>
               <w:jc w:val="center"/>
               <w:rPr>
-                <w:rFonts w:ascii="Tahoma" w:cs="Tahoma" w:eastAsia="Tahoma" w:hAnsi="Tahoma"/>
                 <w:b w:val="1"/>
                 <w:bCs w:val="1"/>
                 <w:i w:val="0"/>
@@ -1405,8 +1327,6 @@
                 <w:smallCaps w:val="0"/>
                 <w:strike w:val="0"/>
                 <w:color w:val="6e2500"/>
-                <w:sz w:val="20"/>
-                <w:szCs w:val="20"/>
                 <w:u w:val="none"/>
                 <w:shd w:fill="auto" w:val="clear"/>
                 <w:vertAlign w:val="baseline"/>
@@ -1414,7 +1334,6 @@
             </w:pPr>
             <w:r>
               <w:rPr>
-                <w:rFonts w:ascii="Tahoma" w:cs="Tahoma" w:eastAsia="Tahoma" w:hAnsi="Tahoma"/>
                 <w:b w:val="1"/>
                 <w:bCs w:val="1"/>
                 <w:i w:val="0"/>
@@ -1422,8 +1341,6 @@
                 <w:smallCaps w:val="0"/>
                 <w:strike w:val="0"/>
                 <w:color w:val="6e2500"/>
-                <w:sz w:val="20"/>
-                <w:szCs w:val="20"/>
                 <w:u w:val="none"/>
                 <w:shd w:fill="auto" w:val="clear"/>
                 <w:vertAlign w:val="baseline"/>
@@ -1454,7 +1371,6 @@
               <w:ind w:left="0" w:right="0" w:firstLine="0"/>
               <w:jc w:val="center"/>
               <w:rPr>
-                <w:rFonts w:ascii="Tahoma" w:cs="Tahoma" w:eastAsia="Tahoma" w:hAnsi="Tahoma"/>
                 <w:b w:val="1"/>
                 <w:bCs w:val="1"/>
                 <w:i w:val="0"/>
@@ -1462,8 +1378,6 @@
                 <w:smallCaps w:val="0"/>
                 <w:strike w:val="0"/>
                 <w:color w:val="6e2500"/>
-                <w:sz w:val="20"/>
-                <w:szCs w:val="20"/>
                 <w:u w:val="none"/>
                 <w:shd w:fill="auto" w:val="clear"/>
                 <w:vertAlign w:val="baseline"/>
@@ -1471,7 +1385,6 @@
             </w:pPr>
             <w:r>
               <w:rPr>
-                <w:rFonts w:ascii="Tahoma" w:cs="Tahoma" w:eastAsia="Tahoma" w:hAnsi="Tahoma"/>
                 <w:b w:val="1"/>
                 <w:bCs w:val="1"/>
                 <w:i w:val="0"/>
@@ -1479,8 +1392,6 @@
                 <w:smallCaps w:val="0"/>
                 <w:strike w:val="0"/>
                 <w:color w:val="6e2500"/>
-                <w:sz w:val="20"/>
-                <w:szCs w:val="20"/>
                 <w:u w:val="none"/>
                 <w:shd w:fill="auto" w:val="clear"/>
                 <w:vertAlign w:val="baseline"/>
@@ -1513,7 +1424,6 @@
               <w:ind w:left="0" w:right="0" w:firstLine="0"/>
               <w:jc w:val="center"/>
               <w:rPr>
-                <w:rFonts w:ascii="Tahoma" w:cs="Tahoma" w:eastAsia="Tahoma" w:hAnsi="Tahoma"/>
                 <w:b w:val="1"/>
                 <w:bCs w:val="1"/>
                 <w:i w:val="0"/>
@@ -1521,8 +1431,6 @@
                 <w:smallCaps w:val="0"/>
                 <w:strike w:val="0"/>
                 <w:color w:val="6e2500"/>
-                <w:sz w:val="20"/>
-                <w:szCs w:val="20"/>
                 <w:u w:val="none"/>
                 <w:shd w:fill="auto" w:val="clear"/>
                 <w:vertAlign w:val="baseline"/>
@@ -1530,7 +1438,6 @@
             </w:pPr>
             <w:r>
               <w:rPr>
-                <w:rFonts w:ascii="Tahoma" w:cs="Tahoma" w:eastAsia="Tahoma" w:hAnsi="Tahoma"/>
                 <w:b w:val="1"/>
                 <w:bCs w:val="1"/>
                 <w:i w:val="0"/>
@@ -1538,8 +1445,6 @@
                 <w:smallCaps w:val="0"/>
                 <w:strike w:val="0"/>
                 <w:color w:val="6e2500"/>
-                <w:sz w:val="20"/>
-                <w:szCs w:val="20"/>
                 <w:u w:val="none"/>
                 <w:shd w:fill="auto" w:val="clear"/>
                 <w:vertAlign w:val="baseline"/>
@@ -1570,7 +1475,6 @@
               <w:ind w:left="0" w:right="0" w:firstLine="0"/>
               <w:jc w:val="center"/>
               <w:rPr>
-                <w:rFonts w:ascii="Tahoma" w:cs="Tahoma" w:eastAsia="Tahoma" w:hAnsi="Tahoma"/>
                 <w:b w:val="1"/>
                 <w:bCs w:val="1"/>
                 <w:i w:val="0"/>
@@ -1578,8 +1482,6 @@
                 <w:smallCaps w:val="0"/>
                 <w:strike w:val="0"/>
                 <w:color w:val="6e2500"/>
-                <w:sz w:val="20"/>
-                <w:szCs w:val="20"/>
                 <w:u w:val="none"/>
                 <w:shd w:fill="auto" w:val="clear"/>
                 <w:vertAlign w:val="baseline"/>
@@ -1587,7 +1489,6 @@
             </w:pPr>
             <w:r>
               <w:rPr>
-                <w:rFonts w:ascii="Tahoma" w:cs="Tahoma" w:eastAsia="Tahoma" w:hAnsi="Tahoma"/>
                 <w:b w:val="1"/>
                 <w:bCs w:val="1"/>
                 <w:i w:val="0"/>
@@ -1595,8 +1496,6 @@
                 <w:smallCaps w:val="0"/>
                 <w:strike w:val="0"/>
                 <w:color w:val="6e2500"/>
-                <w:sz w:val="20"/>
-                <w:szCs w:val="20"/>
                 <w:u w:val="none"/>
                 <w:shd w:fill="auto" w:val="clear"/>
                 <w:vertAlign w:val="baseline"/>
@@ -2119,16 +2018,11 @@
               <w:ind w:left="0" w:right="0" w:firstLine="0"/>
               <w:jc w:val="left"/>
               <w:rPr>
-                <w:rFonts w:ascii="Tahoma" w:cs="Tahoma" w:eastAsia="Tahoma" w:hAnsi="Tahoma"/>
-                <w:b w:val="0"/>
-                <w:bCs w:val="0"/>
                 <w:i w:val="0"/>
                 <w:iCs w:val="0"/>
                 <w:smallCaps w:val="0"/>
                 <w:strike w:val="0"/>
                 <w:color w:val="000000"/>
-                <w:sz w:val="18"/>
-                <w:szCs w:val="18"/>
                 <w:u w:val="none"/>
                 <w:shd w:fill="auto" w:val="clear"/>
                 <w:vertAlign w:val="baseline"/>
@@ -2136,9 +2030,6 @@
             </w:pPr>
             <w:r>
               <w:rPr>
-                <w:rFonts w:ascii="Tahoma" w:cs="Tahoma" w:eastAsia="Tahoma" w:hAnsi="Tahoma"/>
-                <w:sz w:val="18"/>
-                <w:szCs w:val="18"/>
                 <w:rtl w:val="0"/>
               </w:rPr>
               <w:t xml:space="preserve">02/10/2026</w:t>
@@ -2169,16 +2060,11 @@
               <w:ind w:left="0" w:right="0" w:firstLine="0"/>
               <w:jc w:val="left"/>
               <w:rPr>
-                <w:rFonts w:ascii="Tahoma" w:cs="Tahoma" w:eastAsia="Tahoma" w:hAnsi="Tahoma"/>
-                <w:b w:val="0"/>
-                <w:bCs w:val="0"/>
                 <w:i w:val="0"/>
                 <w:iCs w:val="0"/>
                 <w:smallCaps w:val="0"/>
                 <w:strike w:val="0"/>
                 <w:color w:val="000000"/>
-                <w:sz w:val="18"/>
-                <w:szCs w:val="18"/>
                 <w:u w:val="none"/>
                 <w:shd w:fill="auto" w:val="clear"/>
                 <w:vertAlign w:val="baseline"/>
@@ -2186,9 +2072,6 @@
             </w:pPr>
             <w:r>
               <w:rPr>
-                <w:rFonts w:ascii="Tahoma" w:cs="Tahoma" w:eastAsia="Tahoma" w:hAnsi="Tahoma"/>
-                <w:sz w:val="18"/>
-                <w:szCs w:val="18"/>
                 <w:rtl w:val="0"/>
               </w:rPr>
               <w:t xml:space="preserve">A</w:t>
@@ -2219,16 +2102,11 @@
               <w:ind w:left="0" w:right="0" w:firstLine="0"/>
               <w:jc w:val="left"/>
               <w:rPr>
-                <w:rFonts w:ascii="Tahoma" w:cs="Tahoma" w:eastAsia="Tahoma" w:hAnsi="Tahoma"/>
-                <w:b w:val="0"/>
-                <w:bCs w:val="0"/>
                 <w:i w:val="0"/>
                 <w:iCs w:val="0"/>
                 <w:smallCaps w:val="0"/>
                 <w:strike w:val="0"/>
                 <w:color w:val="000000"/>
-                <w:sz w:val="18"/>
-                <w:szCs w:val="18"/>
                 <w:u w:val="none"/>
                 <w:shd w:fill="auto" w:val="clear"/>
                 <w:vertAlign w:val="baseline"/>
@@ -2236,9 +2114,6 @@
             </w:pPr>
             <w:r>
               <w:rPr>
-                <w:rFonts w:ascii="Tahoma" w:cs="Tahoma" w:eastAsia="Tahoma" w:hAnsi="Tahoma"/>
-                <w:sz w:val="18"/>
-                <w:szCs w:val="18"/>
                 <w:rtl w:val="0"/>
               </w:rPr>
               <w:t xml:space="preserve">HuyDV</w:t>
@@ -2269,16 +2144,11 @@
               <w:ind w:left="0" w:right="0" w:firstLine="0"/>
               <w:jc w:val="left"/>
               <w:rPr>
-                <w:rFonts w:ascii="Tahoma" w:cs="Tahoma" w:eastAsia="Tahoma" w:hAnsi="Tahoma"/>
-                <w:b w:val="0"/>
-                <w:bCs w:val="0"/>
                 <w:i w:val="0"/>
                 <w:iCs w:val="0"/>
                 <w:smallCaps w:val="0"/>
                 <w:strike w:val="0"/>
                 <w:color w:val="000000"/>
-                <w:sz w:val="10"/>
-                <w:szCs w:val="10"/>
                 <w:u w:val="none"/>
                 <w:shd w:fill="auto" w:val="clear"/>
                 <w:vertAlign w:val="baseline"/>
@@ -2286,9 +2156,6 @@
             </w:pPr>
             <w:r>
               <w:rPr>
-                <w:rFonts w:ascii="Tahoma" w:cs="Tahoma" w:eastAsia="Tahoma" w:hAnsi="Tahoma"/>
-                <w:sz w:val="18"/>
-                <w:szCs w:val="18"/>
                 <w:rtl w:val="0"/>
               </w:rPr>
               <w:t xml:space="preserve">Added selection summary</w:t>
@@ -2325,16 +2192,11 @@
               <w:ind w:left="0" w:right="0" w:firstLine="0"/>
               <w:jc w:val="left"/>
               <w:rPr>
-                <w:rFonts w:ascii="Tahoma" w:cs="Tahoma" w:eastAsia="Tahoma" w:hAnsi="Tahoma"/>
-                <w:b w:val="0"/>
-                <w:bCs w:val="0"/>
                 <w:i w:val="0"/>
                 <w:iCs w:val="0"/>
                 <w:smallCaps w:val="0"/>
                 <w:strike w:val="0"/>
                 <w:color w:val="000000"/>
-                <w:sz w:val="18"/>
-                <w:szCs w:val="18"/>
                 <w:u w:val="none"/>
                 <w:shd w:fill="auto" w:val="clear"/>
                 <w:vertAlign w:val="baseline"/>
@@ -2342,9 +2204,6 @@
             </w:pPr>
             <w:r>
               <w:rPr>
-                <w:rFonts w:ascii="Tahoma" w:cs="Tahoma" w:eastAsia="Tahoma" w:hAnsi="Tahoma"/>
-                <w:sz w:val="18"/>
-                <w:szCs w:val="18"/>
                 <w:rtl w:val="0"/>
               </w:rPr>
               <w:t xml:space="preserve">03/10/2026</w:t>
@@ -2375,16 +2234,11 @@
               <w:ind w:left="0" w:right="0" w:firstLine="0"/>
               <w:jc w:val="left"/>
               <w:rPr>
-                <w:rFonts w:ascii="Tahoma" w:cs="Tahoma" w:eastAsia="Tahoma" w:hAnsi="Tahoma"/>
-                <w:b w:val="0"/>
-                <w:bCs w:val="0"/>
                 <w:i w:val="0"/>
                 <w:iCs w:val="0"/>
                 <w:smallCaps w:val="0"/>
                 <w:strike w:val="0"/>
                 <w:color w:val="000000"/>
-                <w:sz w:val="18"/>
-                <w:szCs w:val="18"/>
                 <w:u w:val="none"/>
                 <w:shd w:fill="auto" w:val="clear"/>
                 <w:vertAlign w:val="baseline"/>
@@ -2392,9 +2246,6 @@
             </w:pPr>
             <w:r>
               <w:rPr>
-                <w:rFonts w:ascii="Tahoma" w:cs="Tahoma" w:eastAsia="Tahoma" w:hAnsi="Tahoma"/>
-                <w:sz w:val="18"/>
-                <w:szCs w:val="18"/>
                 <w:rtl w:val="0"/>
               </w:rPr>
               <w:t xml:space="preserve">A</w:t>
@@ -2425,16 +2276,11 @@
               <w:ind w:left="0" w:right="0" w:firstLine="0"/>
               <w:jc w:val="left"/>
               <w:rPr>
-                <w:rFonts w:ascii="Tahoma" w:cs="Tahoma" w:eastAsia="Tahoma" w:hAnsi="Tahoma"/>
-                <w:b w:val="0"/>
-                <w:bCs w:val="0"/>
                 <w:i w:val="0"/>
                 <w:iCs w:val="0"/>
                 <w:smallCaps w:val="0"/>
                 <w:strike w:val="0"/>
                 <w:color w:val="000000"/>
-                <w:sz w:val="18"/>
-                <w:szCs w:val="18"/>
                 <w:u w:val="none"/>
                 <w:shd w:fill="auto" w:val="clear"/>
                 <w:vertAlign w:val="baseline"/>
@@ -2442,9 +2288,6 @@
             </w:pPr>
             <w:r>
               <w:rPr>
-                <w:rFonts w:ascii="Tahoma" w:cs="Tahoma" w:eastAsia="Tahoma" w:hAnsi="Tahoma"/>
-                <w:sz w:val="18"/>
-                <w:szCs w:val="18"/>
                 <w:rtl w:val="0"/>
               </w:rPr>
               <w:t xml:space="preserve">HuyDV</w:t>
@@ -2475,16 +2318,11 @@
               <w:ind w:left="0" w:right="0" w:firstLine="0"/>
               <w:jc w:val="left"/>
               <w:rPr>
-                <w:rFonts w:ascii="Tahoma" w:cs="Tahoma" w:eastAsia="Tahoma" w:hAnsi="Tahoma"/>
-                <w:b w:val="0"/>
-                <w:bCs w:val="0"/>
                 <w:i w:val="0"/>
                 <w:iCs w:val="0"/>
                 <w:smallCaps w:val="0"/>
                 <w:strike w:val="0"/>
                 <w:color w:val="000000"/>
-                <w:sz w:val="18"/>
-                <w:szCs w:val="18"/>
                 <w:u w:val="none"/>
                 <w:shd w:fill="auto" w:val="clear"/>
                 <w:vertAlign w:val="baseline"/>
@@ -2492,9 +2330,6 @@
             </w:pPr>
             <w:r>
               <w:rPr>
-                <w:rFonts w:ascii="Tahoma" w:cs="Tahoma" w:eastAsia="Tahoma" w:hAnsi="Tahoma"/>
-                <w:sz w:val="18"/>
-                <w:szCs w:val="18"/>
                 <w:rtl w:val="0"/>
               </w:rPr>
               <w:t xml:space="preserve">Add other existing solutions in the market</w:t>
@@ -2531,16 +2366,11 @@
               <w:ind w:left="0" w:right="0" w:firstLine="0"/>
               <w:jc w:val="left"/>
               <w:rPr>
-                <w:rFonts w:ascii="Tahoma" w:cs="Tahoma" w:eastAsia="Tahoma" w:hAnsi="Tahoma"/>
-                <w:b w:val="0"/>
-                <w:bCs w:val="0"/>
                 <w:i w:val="0"/>
                 <w:iCs w:val="0"/>
                 <w:smallCaps w:val="0"/>
                 <w:strike w:val="0"/>
                 <w:color w:val="000000"/>
-                <w:sz w:val="18"/>
-                <w:szCs w:val="18"/>
                 <w:u w:val="none"/>
                 <w:shd w:fill="auto" w:val="clear"/>
                 <w:vertAlign w:val="baseline"/>
@@ -2548,9 +2378,6 @@
             </w:pPr>
             <w:r>
               <w:rPr>
-                <w:rFonts w:ascii="Tahoma" w:cs="Tahoma" w:eastAsia="Tahoma" w:hAnsi="Tahoma"/>
-                <w:sz w:val="18"/>
-                <w:szCs w:val="18"/>
                 <w:rtl w:val="0"/>
               </w:rPr>
               <w:t xml:space="preserve">05/10/2026</w:t>
@@ -2581,16 +2408,11 @@
               <w:ind w:left="0" w:right="0" w:firstLine="0"/>
               <w:jc w:val="left"/>
               <w:rPr>
-                <w:rFonts w:ascii="Tahoma" w:cs="Tahoma" w:eastAsia="Tahoma" w:hAnsi="Tahoma"/>
-                <w:b w:val="0"/>
-                <w:bCs w:val="0"/>
                 <w:i w:val="0"/>
                 <w:iCs w:val="0"/>
                 <w:smallCaps w:val="0"/>
                 <w:strike w:val="0"/>
                 <w:color w:val="000000"/>
-                <w:sz w:val="18"/>
-                <w:szCs w:val="18"/>
                 <w:u w:val="none"/>
                 <w:shd w:fill="auto" w:val="clear"/>
                 <w:vertAlign w:val="baseline"/>
@@ -2598,9 +2420,6 @@
             </w:pPr>
             <w:r>
               <w:rPr>
-                <w:rFonts w:ascii="Tahoma" w:cs="Tahoma" w:eastAsia="Tahoma" w:hAnsi="Tahoma"/>
-                <w:sz w:val="18"/>
-                <w:szCs w:val="18"/>
                 <w:rtl w:val="0"/>
               </w:rPr>
               <w:t xml:space="preserve">A</w:t>
@@ -2631,16 +2450,11 @@
               <w:ind w:left="0" w:right="0" w:firstLine="0"/>
               <w:jc w:val="left"/>
               <w:rPr>
-                <w:rFonts w:ascii="Tahoma" w:cs="Tahoma" w:eastAsia="Tahoma" w:hAnsi="Tahoma"/>
-                <w:b w:val="0"/>
-                <w:bCs w:val="0"/>
                 <w:i w:val="0"/>
                 <w:iCs w:val="0"/>
                 <w:smallCaps w:val="0"/>
                 <w:strike w:val="0"/>
                 <w:color w:val="000000"/>
-                <w:sz w:val="18"/>
-                <w:szCs w:val="18"/>
                 <w:u w:val="none"/>
                 <w:shd w:fill="auto" w:val="clear"/>
                 <w:vertAlign w:val="baseline"/>
@@ -2648,9 +2462,6 @@
             </w:pPr>
             <w:r>
               <w:rPr>
-                <w:rFonts w:ascii="Tahoma" w:cs="Tahoma" w:eastAsia="Tahoma" w:hAnsi="Tahoma"/>
-                <w:sz w:val="18"/>
-                <w:szCs w:val="18"/>
                 <w:rtl w:val="0"/>
               </w:rPr>
               <w:t xml:space="preserve">ThanhNT</w:t>
@@ -2680,17 +2491,10 @@
               <w:spacing w:after="80" w:before="80" w:line="240" w:lineRule="auto"/>
               <w:ind w:left="0" w:right="0" w:firstLine="0"/>
               <w:jc w:val="left"/>
-              <w:rPr>
-                <w:rFonts w:ascii="Tahoma" w:cs="Tahoma" w:eastAsia="Tahoma" w:hAnsi="Tahoma"/>
-                <w:sz w:val="18"/>
-                <w:szCs w:val="18"/>
-              </w:rPr>
-            </w:pPr>
-            <w:r>
-              <w:rPr>
-                <w:rFonts w:ascii="Tahoma" w:cs="Tahoma" w:eastAsia="Tahoma" w:hAnsi="Tahoma"/>
-                <w:sz w:val="18"/>
-                <w:szCs w:val="18"/>
+              <w:rPr/>
+            </w:pPr>
+            <w:r>
+              <w:rPr>
                 <w:rtl w:val="0"/>
               </w:rPr>
               <w:t xml:space="preserve">Add other existing solutions in the market</w:t>
@@ -2722,16 +2526,11 @@
               <w:ind w:left="0" w:right="0" w:firstLine="0"/>
               <w:jc w:val="left"/>
               <w:rPr>
-                <w:rFonts w:ascii="Tahoma" w:cs="Tahoma" w:eastAsia="Tahoma" w:hAnsi="Tahoma"/>
-                <w:b w:val="0"/>
-                <w:bCs w:val="0"/>
                 <w:i w:val="0"/>
                 <w:iCs w:val="0"/>
                 <w:smallCaps w:val="0"/>
                 <w:strike w:val="0"/>
                 <w:color w:val="000000"/>
-                <w:sz w:val="18"/>
-                <w:szCs w:val="18"/>
                 <w:u w:val="none"/>
                 <w:shd w:fill="auto" w:val="clear"/>
                 <w:vertAlign w:val="baseline"/>
@@ -2739,9 +2538,6 @@
             </w:pPr>
             <w:r>
               <w:rPr>
-                <w:rFonts w:ascii="Tahoma" w:cs="Tahoma" w:eastAsia="Tahoma" w:hAnsi="Tahoma"/>
-                <w:sz w:val="18"/>
-                <w:szCs w:val="18"/>
                 <w:rtl w:val="0"/>
               </w:rPr>
               <w:t xml:space="preserve">09/10/2026</w:t>
@@ -2772,16 +2568,11 @@
               <w:ind w:left="0" w:right="0" w:firstLine="0"/>
               <w:jc w:val="left"/>
               <w:rPr>
-                <w:rFonts w:ascii="Tahoma" w:cs="Tahoma" w:eastAsia="Tahoma" w:hAnsi="Tahoma"/>
-                <w:b w:val="0"/>
-                <w:bCs w:val="0"/>
                 <w:i w:val="0"/>
                 <w:iCs w:val="0"/>
                 <w:smallCaps w:val="0"/>
                 <w:strike w:val="0"/>
                 <w:color w:val="000000"/>
-                <w:sz w:val="18"/>
-                <w:szCs w:val="18"/>
                 <w:u w:val="none"/>
                 <w:shd w:fill="auto" w:val="clear"/>
                 <w:vertAlign w:val="baseline"/>
@@ -2789,9 +2580,6 @@
             </w:pPr>
             <w:r>
               <w:rPr>
-                <w:rFonts w:ascii="Tahoma" w:cs="Tahoma" w:eastAsia="Tahoma" w:hAnsi="Tahoma"/>
-                <w:sz w:val="18"/>
-                <w:szCs w:val="18"/>
                 <w:rtl w:val="0"/>
               </w:rPr>
               <w:t xml:space="preserve">M</w:t>
@@ -2822,16 +2610,11 @@
               <w:ind w:left="0" w:right="0" w:firstLine="0"/>
               <w:jc w:val="left"/>
               <w:rPr>
-                <w:rFonts w:ascii="Tahoma" w:cs="Tahoma" w:eastAsia="Tahoma" w:hAnsi="Tahoma"/>
-                <w:b w:val="0"/>
-                <w:bCs w:val="0"/>
                 <w:i w:val="0"/>
                 <w:iCs w:val="0"/>
                 <w:smallCaps w:val="0"/>
                 <w:strike w:val="0"/>
                 <w:color w:val="000000"/>
-                <w:sz w:val="18"/>
-                <w:szCs w:val="18"/>
                 <w:u w:val="none"/>
                 <w:shd w:fill="auto" w:val="clear"/>
                 <w:vertAlign w:val="baseline"/>
@@ -2839,9 +2622,6 @@
             </w:pPr>
             <w:r>
               <w:rPr>
-                <w:rFonts w:ascii="Tahoma" w:cs="Tahoma" w:eastAsia="Tahoma" w:hAnsi="Tahoma"/>
-                <w:sz w:val="18"/>
-                <w:szCs w:val="18"/>
                 <w:rtl w:val="0"/>
               </w:rPr>
               <w:t xml:space="preserve">HuyDV</w:t>
@@ -2872,16 +2652,11 @@
               <w:ind w:left="0" w:right="0" w:firstLine="0"/>
               <w:jc w:val="left"/>
               <w:rPr>
-                <w:rFonts w:ascii="Tahoma" w:cs="Tahoma" w:eastAsia="Tahoma" w:hAnsi="Tahoma"/>
-                <w:b w:val="0"/>
-                <w:bCs w:val="0"/>
                 <w:i w:val="0"/>
                 <w:iCs w:val="0"/>
                 <w:smallCaps w:val="0"/>
                 <w:strike w:val="0"/>
                 <w:color w:val="000000"/>
-                <w:sz w:val="18"/>
-                <w:szCs w:val="18"/>
                 <w:u w:val="none"/>
                 <w:shd w:fill="auto" w:val="clear"/>
                 <w:vertAlign w:val="baseline"/>
@@ -2889,9 +2664,6 @@
             </w:pPr>
             <w:r>
               <w:rPr>
-                <w:rFonts w:ascii="Tahoma" w:cs="Tahoma" w:eastAsia="Tahoma" w:hAnsi="Tahoma"/>
-                <w:sz w:val="18"/>
-                <w:szCs w:val="18"/>
                 <w:rtl w:val="0"/>
               </w:rPr>
               <w:t xml:space="preserve">Modify existing solutions and proposed solutions</w:t>
@@ -2900,6 +2672,72 @@
               <w:rPr>
                 <w:rtl w:val="0"/>
               </w:rPr>
+            </w:r>
+          </w:p>
+        </w:tc>
+      </w:tr>
+      <w:tr>
+        <w:trPr>
+          <w:cantSplit w:val="0"/>
+          <w:tblHeader w:val="0"/>
+        </w:trPr>
+        <w:tc>
+          <w:tcPr/>
+          <w:p>
+            <w:pPr>
+              <w:spacing w:after="80" w:before="80" w:line="240" w:lineRule="auto"/>
+              <w:rPr/>
+            </w:pPr>
+            <w:r>
+              <w:rPr>
+                <w:rtl w:val="0"/>
+              </w:rPr>
+              <w:t xml:space="preserve">17/10/2026</w:t>
+            </w:r>
+          </w:p>
+        </w:tc>
+        <w:tc>
+          <w:tcPr/>
+          <w:p>
+            <w:pPr>
+              <w:spacing w:after="80" w:before="80" w:line="240" w:lineRule="auto"/>
+              <w:rPr/>
+            </w:pPr>
+            <w:r>
+              <w:rPr>
+                <w:rtl w:val="0"/>
+              </w:rPr>
+              <w:t xml:space="preserve">M</w:t>
+            </w:r>
+          </w:p>
+        </w:tc>
+        <w:tc>
+          <w:tcPr/>
+          <w:p>
+            <w:pPr>
+              <w:spacing w:after="80" w:before="80" w:line="240" w:lineRule="auto"/>
+              <w:rPr/>
+            </w:pPr>
+            <w:r>
+              <w:rPr>
+                <w:rtl w:val="0"/>
+              </w:rPr>
+              <w:t xml:space="preserve">TrangCTH</w:t>
+            </w:r>
+          </w:p>
+        </w:tc>
+        <w:tc>
+          <w:tcPr/>
+          <w:p>
+            <w:pPr>
+              <w:spacing w:after="80" w:before="80" w:line="240" w:lineRule="auto"/>
+              <w:rPr/>
+            </w:pPr>
+            <w:r>
+              <w:rPr>
+                <w:rtl w:val="0"/>
+              </w:rPr>
+              <w:t xml:space="preserve">Modify Major Features and Limitations &amp; Exclusions</w:t>
             </w:r>
           </w:p>
         </w:tc>
@@ -2928,16 +2766,11 @@
               <w:ind w:left="0" w:right="0" w:firstLine="0"/>
               <w:jc w:val="left"/>
               <w:rPr>
-                <w:rFonts w:ascii="Tahoma" w:cs="Tahoma" w:eastAsia="Tahoma" w:hAnsi="Tahoma"/>
-                <w:b w:val="0"/>
-                <w:bCs w:val="0"/>
                 <w:i w:val="0"/>
                 <w:iCs w:val="0"/>
                 <w:smallCaps w:val="0"/>
                 <w:strike w:val="0"/>
                 <w:color w:val="000000"/>
-                <w:sz w:val="18"/>
-                <w:szCs w:val="18"/>
                 <w:u w:val="none"/>
                 <w:shd w:fill="auto" w:val="clear"/>
                 <w:vertAlign w:val="baseline"/>
@@ -2969,16 +2802,11 @@
               <w:ind w:left="0" w:right="0" w:firstLine="0"/>
               <w:jc w:val="left"/>
               <w:rPr>
-                <w:rFonts w:ascii="Tahoma" w:cs="Tahoma" w:eastAsia="Tahoma" w:hAnsi="Tahoma"/>
-                <w:b w:val="0"/>
-                <w:bCs w:val="0"/>
                 <w:i w:val="0"/>
                 <w:iCs w:val="0"/>
                 <w:smallCaps w:val="0"/>
                 <w:strike w:val="0"/>
                 <w:color w:val="000000"/>
-                <w:sz w:val="18"/>
-                <w:szCs w:val="18"/>
                 <w:u w:val="none"/>
                 <w:shd w:fill="auto" w:val="clear"/>
                 <w:vertAlign w:val="baseline"/>
@@ -3010,16 +2838,11 @@
               <w:ind w:left="0" w:right="0" w:firstLine="0"/>
               <w:jc w:val="left"/>
               <w:rPr>
-                <w:rFonts w:ascii="Tahoma" w:cs="Tahoma" w:eastAsia="Tahoma" w:hAnsi="Tahoma"/>
-                <w:b w:val="0"/>
-                <w:bCs w:val="0"/>
                 <w:i w:val="0"/>
                 <w:iCs w:val="0"/>
                 <w:smallCaps w:val="0"/>
                 <w:strike w:val="0"/>
                 <w:color w:val="000000"/>
-                <w:sz w:val="18"/>
-                <w:szCs w:val="18"/>
                 <w:u w:val="none"/>
                 <w:shd w:fill="auto" w:val="clear"/>
                 <w:vertAlign w:val="baseline"/>
@@ -3051,16 +2874,11 @@
               <w:ind w:left="0" w:right="0" w:firstLine="0"/>
               <w:jc w:val="left"/>
               <w:rPr>
-                <w:rFonts w:ascii="Tahoma" w:cs="Tahoma" w:eastAsia="Tahoma" w:hAnsi="Tahoma"/>
-                <w:b w:val="0"/>
-                <w:bCs w:val="0"/>
                 <w:i w:val="0"/>
                 <w:iCs w:val="0"/>
                 <w:smallCaps w:val="0"/>
                 <w:strike w:val="0"/>
                 <w:color w:val="000000"/>
-                <w:sz w:val="18"/>
-                <w:szCs w:val="18"/>
                 <w:u w:val="none"/>
                 <w:shd w:fill="auto" w:val="clear"/>
                 <w:vertAlign w:val="baseline"/>
@@ -3098,16 +2916,11 @@
               <w:ind w:left="0" w:right="0" w:firstLine="0"/>
               <w:jc w:val="left"/>
               <w:rPr>
-                <w:rFonts w:ascii="Tahoma" w:cs="Tahoma" w:eastAsia="Tahoma" w:hAnsi="Tahoma"/>
-                <w:b w:val="0"/>
-                <w:bCs w:val="0"/>
                 <w:i w:val="0"/>
                 <w:iCs w:val="0"/>
                 <w:smallCaps w:val="0"/>
                 <w:strike w:val="0"/>
                 <w:color w:val="000000"/>
-                <w:sz w:val="18"/>
-                <w:szCs w:val="18"/>
                 <w:u w:val="none"/>
                 <w:shd w:fill="auto" w:val="clear"/>
                 <w:vertAlign w:val="baseline"/>
@@ -3139,16 +2952,11 @@
               <w:ind w:left="0" w:right="0" w:firstLine="0"/>
               <w:jc w:val="left"/>
               <w:rPr>
-                <w:rFonts w:ascii="Tahoma" w:cs="Tahoma" w:eastAsia="Tahoma" w:hAnsi="Tahoma"/>
-                <w:b w:val="0"/>
-                <w:bCs w:val="0"/>
                 <w:i w:val="0"/>
                 <w:iCs w:val="0"/>
                 <w:smallCaps w:val="0"/>
                 <w:strike w:val="0"/>
                 <w:color w:val="000000"/>
-                <w:sz w:val="18"/>
-                <w:szCs w:val="18"/>
                 <w:u w:val="none"/>
                 <w:shd w:fill="auto" w:val="clear"/>
                 <w:vertAlign w:val="baseline"/>
@@ -3180,16 +2988,11 @@
               <w:ind w:left="0" w:right="0" w:firstLine="0"/>
               <w:jc w:val="left"/>
               <w:rPr>
-                <w:rFonts w:ascii="Tahoma" w:cs="Tahoma" w:eastAsia="Tahoma" w:hAnsi="Tahoma"/>
-                <w:b w:val="0"/>
-                <w:bCs w:val="0"/>
                 <w:i w:val="0"/>
                 <w:iCs w:val="0"/>
                 <w:smallCaps w:val="0"/>
                 <w:strike w:val="0"/>
                 <w:color w:val="000000"/>
-                <w:sz w:val="18"/>
-                <w:szCs w:val="18"/>
                 <w:u w:val="none"/>
                 <w:shd w:fill="auto" w:val="clear"/>
                 <w:vertAlign w:val="baseline"/>
@@ -3221,16 +3024,11 @@
               <w:ind w:left="0" w:right="0" w:firstLine="0"/>
               <w:jc w:val="left"/>
               <w:rPr>
-                <w:rFonts w:ascii="Tahoma" w:cs="Tahoma" w:eastAsia="Tahoma" w:hAnsi="Tahoma"/>
-                <w:b w:val="0"/>
-                <w:bCs w:val="0"/>
                 <w:i w:val="0"/>
                 <w:iCs w:val="0"/>
                 <w:smallCaps w:val="0"/>
                 <w:strike w:val="0"/>
                 <w:color w:val="000000"/>
-                <w:sz w:val="18"/>
-                <w:szCs w:val="18"/>
                 <w:u w:val="none"/>
                 <w:shd w:fill="auto" w:val="clear"/>
                 <w:vertAlign w:val="baseline"/>
@@ -3268,16 +3066,11 @@
               <w:ind w:left="0" w:right="0" w:firstLine="0"/>
               <w:jc w:val="left"/>
               <w:rPr>
-                <w:rFonts w:ascii="Tahoma" w:cs="Tahoma" w:eastAsia="Tahoma" w:hAnsi="Tahoma"/>
-                <w:b w:val="0"/>
-                <w:bCs w:val="0"/>
                 <w:i w:val="0"/>
                 <w:iCs w:val="0"/>
                 <w:smallCaps w:val="0"/>
                 <w:strike w:val="0"/>
                 <w:color w:val="000000"/>
-                <w:sz w:val="18"/>
-                <w:szCs w:val="18"/>
                 <w:u w:val="none"/>
                 <w:shd w:fill="auto" w:val="clear"/>
                 <w:vertAlign w:val="baseline"/>
@@ -3309,16 +3102,11 @@
               <w:ind w:left="0" w:right="0" w:firstLine="0"/>
               <w:jc w:val="left"/>
               <w:rPr>
-                <w:rFonts w:ascii="Tahoma" w:cs="Tahoma" w:eastAsia="Tahoma" w:hAnsi="Tahoma"/>
-                <w:b w:val="0"/>
-                <w:bCs w:val="0"/>
                 <w:i w:val="0"/>
                 <w:iCs w:val="0"/>
                 <w:smallCaps w:val="0"/>
                 <w:strike w:val="0"/>
                 <w:color w:val="000000"/>
-                <w:sz w:val="18"/>
-                <w:szCs w:val="18"/>
                 <w:u w:val="none"/>
                 <w:shd w:fill="auto" w:val="clear"/>
                 <w:vertAlign w:val="baseline"/>
@@ -3350,16 +3138,11 @@
               <w:ind w:left="0" w:right="0" w:firstLine="0"/>
               <w:jc w:val="left"/>
               <w:rPr>
-                <w:rFonts w:ascii="Tahoma" w:cs="Tahoma" w:eastAsia="Tahoma" w:hAnsi="Tahoma"/>
-                <w:b w:val="0"/>
-                <w:bCs w:val="0"/>
                 <w:i w:val="0"/>
                 <w:iCs w:val="0"/>
                 <w:smallCaps w:val="0"/>
                 <w:strike w:val="0"/>
                 <w:color w:val="000000"/>
-                <w:sz w:val="18"/>
-                <w:szCs w:val="18"/>
                 <w:u w:val="none"/>
                 <w:shd w:fill="auto" w:val="clear"/>
                 <w:vertAlign w:val="baseline"/>
@@ -3391,16 +3174,11 @@
               <w:ind w:left="0" w:right="0" w:firstLine="0"/>
               <w:jc w:val="left"/>
               <w:rPr>
-                <w:rFonts w:ascii="Tahoma" w:cs="Tahoma" w:eastAsia="Tahoma" w:hAnsi="Tahoma"/>
-                <w:b w:val="0"/>
-                <w:bCs w:val="0"/>
                 <w:i w:val="0"/>
                 <w:iCs w:val="0"/>
                 <w:smallCaps w:val="0"/>
                 <w:strike w:val="0"/>
                 <w:color w:val="000000"/>
-                <w:sz w:val="18"/>
-                <w:szCs w:val="18"/>
                 <w:u w:val="none"/>
                 <w:shd w:fill="auto" w:val="clear"/>
                 <w:vertAlign w:val="baseline"/>
@@ -3438,16 +3216,11 @@
               <w:ind w:left="0" w:right="0" w:firstLine="0"/>
               <w:jc w:val="left"/>
               <w:rPr>
-                <w:rFonts w:ascii="Tahoma" w:cs="Tahoma" w:eastAsia="Tahoma" w:hAnsi="Tahoma"/>
-                <w:b w:val="0"/>
-                <w:bCs w:val="0"/>
                 <w:i w:val="0"/>
                 <w:iCs w:val="0"/>
                 <w:smallCaps w:val="0"/>
                 <w:strike w:val="0"/>
                 <w:color w:val="000000"/>
-                <w:sz w:val="18"/>
-                <w:szCs w:val="18"/>
                 <w:u w:val="none"/>
                 <w:shd w:fill="auto" w:val="clear"/>
                 <w:vertAlign w:val="baseline"/>
@@ -3479,16 +3252,11 @@
               <w:ind w:left="0" w:right="0" w:firstLine="0"/>
               <w:jc w:val="left"/>
               <w:rPr>
-                <w:rFonts w:ascii="Tahoma" w:cs="Tahoma" w:eastAsia="Tahoma" w:hAnsi="Tahoma"/>
-                <w:b w:val="0"/>
-                <w:bCs w:val="0"/>
                 <w:i w:val="0"/>
                 <w:iCs w:val="0"/>
                 <w:smallCaps w:val="0"/>
                 <w:strike w:val="0"/>
                 <w:color w:val="000000"/>
-                <w:sz w:val="18"/>
-                <w:szCs w:val="18"/>
                 <w:u w:val="none"/>
                 <w:shd w:fill="auto" w:val="clear"/>
                 <w:vertAlign w:val="baseline"/>
@@ -3520,16 +3288,11 @@
               <w:ind w:left="0" w:right="0" w:firstLine="0"/>
               <w:jc w:val="left"/>
               <w:rPr>
-                <w:rFonts w:ascii="Tahoma" w:cs="Tahoma" w:eastAsia="Tahoma" w:hAnsi="Tahoma"/>
-                <w:b w:val="0"/>
-                <w:bCs w:val="0"/>
                 <w:i w:val="0"/>
                 <w:iCs w:val="0"/>
                 <w:smallCaps w:val="0"/>
                 <w:strike w:val="0"/>
                 <w:color w:val="000000"/>
-                <w:sz w:val="18"/>
-                <w:szCs w:val="18"/>
                 <w:u w:val="none"/>
                 <w:shd w:fill="auto" w:val="clear"/>
                 <w:vertAlign w:val="baseline"/>
@@ -3561,16 +3324,11 @@
               <w:ind w:left="0" w:right="0" w:firstLine="0"/>
               <w:jc w:val="left"/>
               <w:rPr>
-                <w:rFonts w:ascii="Tahoma" w:cs="Tahoma" w:eastAsia="Tahoma" w:hAnsi="Tahoma"/>
-                <w:b w:val="0"/>
-                <w:bCs w:val="0"/>
                 <w:i w:val="0"/>
                 <w:iCs w:val="0"/>
                 <w:smallCaps w:val="0"/>
                 <w:strike w:val="0"/>
                 <w:color w:val="000000"/>
-                <w:sz w:val="18"/>
-                <w:szCs w:val="18"/>
                 <w:u w:val="none"/>
                 <w:shd w:fill="auto" w:val="clear"/>
                 <w:vertAlign w:val="baseline"/>
@@ -3608,16 +3366,13 @@
               <w:ind w:left="0" w:right="0" w:firstLine="0"/>
               <w:jc w:val="left"/>
               <w:rPr>
-                <w:rFonts w:ascii="Tahoma" w:cs="Tahoma" w:eastAsia="Tahoma" w:hAnsi="Tahoma"/>
-                <w:b w:val="0"/>
-                <w:bCs w:val="0"/>
                 <w:i w:val="0"/>
                 <w:iCs w:val="0"/>
                 <w:smallCaps w:val="0"/>
                 <w:strike w:val="0"/>
                 <w:color w:val="000000"/>
-                <w:sz w:val="18"/>
-                <w:szCs w:val="18"/>
+                <w:sz w:val="20"/>
+                <w:szCs w:val="20"/>
                 <w:u w:val="none"/>
                 <w:shd w:fill="auto" w:val="clear"/>
                 <w:vertAlign w:val="baseline"/>
@@ -3649,16 +3404,13 @@
               <w:ind w:left="0" w:right="0" w:firstLine="0"/>
               <w:jc w:val="left"/>
               <w:rPr>
-                <w:rFonts w:ascii="Tahoma" w:cs="Tahoma" w:eastAsia="Tahoma" w:hAnsi="Tahoma"/>
-                <w:b w:val="0"/>
-                <w:bCs w:val="0"/>
                 <w:i w:val="0"/>
                 <w:iCs w:val="0"/>
                 <w:smallCaps w:val="0"/>
                 <w:strike w:val="0"/>
                 <w:color w:val="000000"/>
-                <w:sz w:val="18"/>
-                <w:szCs w:val="18"/>
+                <w:sz w:val="20"/>
+                <w:szCs w:val="20"/>
                 <w:u w:val="none"/>
                 <w:shd w:fill="auto" w:val="clear"/>
                 <w:vertAlign w:val="baseline"/>
@@ -3690,16 +3442,13 @@
               <w:ind w:left="0" w:right="0" w:firstLine="0"/>
               <w:jc w:val="left"/>
               <w:rPr>
-                <w:rFonts w:ascii="Tahoma" w:cs="Tahoma" w:eastAsia="Tahoma" w:hAnsi="Tahoma"/>
-                <w:b w:val="0"/>
-                <w:bCs w:val="0"/>
                 <w:i w:val="0"/>
                 <w:iCs w:val="0"/>
                 <w:smallCaps w:val="0"/>
                 <w:strike w:val="0"/>
                 <w:color w:val="000000"/>
-                <w:sz w:val="18"/>
-                <w:szCs w:val="18"/>
+                <w:sz w:val="20"/>
+                <w:szCs w:val="20"/>
                 <w:u w:val="none"/>
                 <w:shd w:fill="auto" w:val="clear"/>
                 <w:vertAlign w:val="baseline"/>
@@ -3731,186 +3480,13 @@
               <w:ind w:left="0" w:right="0" w:firstLine="0"/>
               <w:jc w:val="left"/>
               <w:rPr>
-                <w:rFonts w:ascii="Tahoma" w:cs="Tahoma" w:eastAsia="Tahoma" w:hAnsi="Tahoma"/>
-                <w:b w:val="0"/>
-                <w:bCs w:val="0"/>
                 <w:i w:val="0"/>
                 <w:iCs w:val="0"/>
                 <w:smallCaps w:val="0"/>
                 <w:strike w:val="0"/>
                 <w:color w:val="000000"/>
-                <w:sz w:val="18"/>
-                <w:szCs w:val="18"/>
-                <w:u w:val="none"/>
-                <w:shd w:fill="auto" w:val="clear"/>
-                <w:vertAlign w:val="baseline"/>
-              </w:rPr>
-            </w:pPr>
-            <w:r>
-              <w:rPr>
-                <w:rtl w:val="0"/>
-              </w:rPr>
-            </w:r>
-          </w:p>
-        </w:tc>
-      </w:tr>
-      <w:tr>
-        <w:trPr>
-          <w:cantSplit w:val="0"/>
-          <w:tblHeader w:val="0"/>
-        </w:trPr>
-        <w:tc>
-          <w:tcPr/>
-          <w:p>
-            <w:pPr>
-              <w:keepNext w:val="0"/>
-              <w:keepLines w:val="0"/>
-              <w:widowControl w:val="1"/>
-              <w:pBdr>
-                <w:top w:space="0" w:sz="0" w:val="nil"/>
-                <w:left w:space="0" w:sz="0" w:val="nil"/>
-                <w:bottom w:space="0" w:sz="0" w:val="nil"/>
-                <w:right w:space="0" w:sz="0" w:val="nil"/>
-                <w:between w:space="0" w:sz="0" w:val="nil"/>
-              </w:pBdr>
-              <w:shd w:fill="auto" w:val="clear"/>
-              <w:spacing w:after="80" w:before="80" w:line="240" w:lineRule="auto"/>
-              <w:ind w:left="0" w:right="0" w:firstLine="0"/>
-              <w:jc w:val="left"/>
-              <w:rPr>
-                <w:rFonts w:ascii="Tahoma" w:cs="Tahoma" w:eastAsia="Tahoma" w:hAnsi="Tahoma"/>
-                <w:b w:val="0"/>
-                <w:bCs w:val="0"/>
-                <w:i w:val="0"/>
-                <w:iCs w:val="0"/>
-                <w:smallCaps w:val="0"/>
-                <w:strike w:val="0"/>
-                <w:color w:val="000000"/>
-                <w:sz w:val="18"/>
-                <w:szCs w:val="18"/>
-                <w:u w:val="none"/>
-                <w:shd w:fill="auto" w:val="clear"/>
-                <w:vertAlign w:val="baseline"/>
-              </w:rPr>
-            </w:pPr>
-            <w:r>
-              <w:rPr>
-                <w:rtl w:val="0"/>
-              </w:rPr>
-            </w:r>
-          </w:p>
-        </w:tc>
-        <w:tc>
-          <w:tcPr/>
-          <w:p>
-            <w:pPr>
-              <w:keepNext w:val="0"/>
-              <w:keepLines w:val="0"/>
-              <w:widowControl w:val="1"/>
-              <w:pBdr>
-                <w:top w:space="0" w:sz="0" w:val="nil"/>
-                <w:left w:space="0" w:sz="0" w:val="nil"/>
-                <w:bottom w:space="0" w:sz="0" w:val="nil"/>
-                <w:right w:space="0" w:sz="0" w:val="nil"/>
-                <w:between w:space="0" w:sz="0" w:val="nil"/>
-              </w:pBdr>
-              <w:shd w:fill="auto" w:val="clear"/>
-              <w:spacing w:after="80" w:before="80" w:line="240" w:lineRule="auto"/>
-              <w:ind w:left="0" w:right="0" w:firstLine="0"/>
-              <w:jc w:val="left"/>
-              <w:rPr>
-                <w:rFonts w:ascii="Tahoma" w:cs="Tahoma" w:eastAsia="Tahoma" w:hAnsi="Tahoma"/>
-                <w:b w:val="0"/>
-                <w:bCs w:val="0"/>
-                <w:i w:val="0"/>
-                <w:iCs w:val="0"/>
-                <w:smallCaps w:val="0"/>
-                <w:strike w:val="0"/>
-                <w:color w:val="000000"/>
-                <w:sz w:val="18"/>
-                <w:szCs w:val="18"/>
-                <w:u w:val="none"/>
-                <w:shd w:fill="auto" w:val="clear"/>
-                <w:vertAlign w:val="baseline"/>
-              </w:rPr>
-            </w:pPr>
-            <w:r>
-              <w:rPr>
-                <w:rtl w:val="0"/>
-              </w:rPr>
-            </w:r>
-          </w:p>
-        </w:tc>
-        <w:tc>
-          <w:tcPr/>
-          <w:p>
-            <w:pPr>
-              <w:keepNext w:val="0"/>
-              <w:keepLines w:val="0"/>
-              <w:widowControl w:val="1"/>
-              <w:pBdr>
-                <w:top w:space="0" w:sz="0" w:val="nil"/>
-                <w:left w:space="0" w:sz="0" w:val="nil"/>
-                <w:bottom w:space="0" w:sz="0" w:val="nil"/>
-                <w:right w:space="0" w:sz="0" w:val="nil"/>
-                <w:between w:space="0" w:sz="0" w:val="nil"/>
-              </w:pBdr>
-              <w:shd w:fill="auto" w:val="clear"/>
-              <w:spacing w:after="80" w:before="80" w:line="240" w:lineRule="auto"/>
-              <w:ind w:left="0" w:right="0" w:firstLine="0"/>
-              <w:jc w:val="left"/>
-              <w:rPr>
-                <w:rFonts w:ascii="Tahoma" w:cs="Tahoma" w:eastAsia="Tahoma" w:hAnsi="Tahoma"/>
-                <w:b w:val="0"/>
-                <w:bCs w:val="0"/>
-                <w:i w:val="0"/>
-                <w:iCs w:val="0"/>
-                <w:smallCaps w:val="0"/>
-                <w:strike w:val="0"/>
-                <w:color w:val="000000"/>
-                <w:sz w:val="18"/>
-                <w:szCs w:val="18"/>
-                <w:u w:val="none"/>
-                <w:shd w:fill="auto" w:val="clear"/>
-                <w:vertAlign w:val="baseline"/>
-              </w:rPr>
-            </w:pPr>
-            <w:r>
-              <w:rPr>
-                <w:rtl w:val="0"/>
-              </w:rPr>
-            </w:r>
-          </w:p>
-        </w:tc>
-        <w:tc>
-          <w:tcPr/>
-          <w:p>
-            <w:pPr>
-              <w:keepNext w:val="0"/>
-              <w:keepLines w:val="0"/>
-              <w:widowControl w:val="1"/>
-              <w:pBdr>
-                <w:top w:space="0" w:sz="0" w:val="nil"/>
-                <w:left w:space="0" w:sz="0" w:val="nil"/>
-                <w:bottom w:space="0" w:sz="0" w:val="nil"/>
-                <w:right w:space="0" w:sz="0" w:val="nil"/>
-                <w:between w:space="0" w:sz="0" w:val="nil"/>
-              </w:pBdr>
-              <w:shd w:fill="auto" w:val="clear"/>
-              <w:spacing w:after="80" w:before="80" w:line="240" w:lineRule="auto"/>
-              <w:ind w:left="0" w:right="0" w:firstLine="0"/>
-              <w:jc w:val="left"/>
-              <w:rPr>
-                <w:rFonts w:ascii="Tahoma" w:cs="Tahoma" w:eastAsia="Tahoma" w:hAnsi="Tahoma"/>
-                <w:b w:val="0"/>
-                <w:bCs w:val="0"/>
-                <w:i w:val="0"/>
-                <w:iCs w:val="0"/>
-                <w:smallCaps w:val="0"/>
-                <w:strike w:val="0"/>
-                <w:color w:val="000000"/>
-                <w:sz w:val="18"/>
-                <w:szCs w:val="18"/>
+                <w:sz w:val="20"/>
+                <w:szCs w:val="20"/>
                 <w:u w:val="none"/>
                 <w:shd w:fill="auto" w:val="clear"/>
                 <w:vertAlign w:val="baseline"/>
@@ -4033,9 +3609,6 @@
       </w:pPr>
       <w:r>
         <w:rPr>
-          <w:rFonts w:ascii="Calibri" w:cs="Calibri" w:eastAsia="Calibri" w:hAnsi="Calibri"/>
-          <w:b w:val="0"/>
-          <w:bCs w:val="0"/>
           <w:i w:val="0"/>
           <w:iCs w:val="0"/>
           <w:smallCaps w:val="0"/>
@@ -4099,9 +3672,6 @@
       </w:pPr>
       <w:r>
         <w:rPr>
-          <w:rFonts w:ascii="Calibri" w:cs="Calibri" w:eastAsia="Calibri" w:hAnsi="Calibri"/>
-          <w:b w:val="0"/>
-          <w:bCs w:val="0"/>
           <w:i w:val="0"/>
           <w:iCs w:val="0"/>
           <w:smallCaps w:val="0"/>
@@ -4176,9 +3746,6 @@
       </w:pPr>
       <w:r>
         <w:rPr>
-          <w:rFonts w:ascii="Calibri" w:cs="Calibri" w:eastAsia="Calibri" w:hAnsi="Calibri"/>
-          <w:b w:val="0"/>
-          <w:bCs w:val="0"/>
           <w:i w:val="0"/>
           <w:iCs w:val="0"/>
           <w:smallCaps w:val="0"/>
@@ -4253,9 +3820,6 @@
       </w:pPr>
       <w:r>
         <w:rPr>
-          <w:rFonts w:ascii="Calibri" w:cs="Calibri" w:eastAsia="Calibri" w:hAnsi="Calibri"/>
-          <w:b w:val="0"/>
-          <w:bCs w:val="0"/>
           <w:i w:val="0"/>
           <w:iCs w:val="0"/>
           <w:smallCaps w:val="0"/>
@@ -4272,7 +3836,6 @@
       </w:r>
       <w:r>
         <w:rPr>
-          <w:rFonts w:ascii="Calibri" w:cs="Calibri" w:eastAsia="Calibri" w:hAnsi="Calibri"/>
           <w:b w:val="1"/>
           <w:bCs w:val="1"/>
           <w:i w:val="1"/>
@@ -4343,9 +3906,6 @@
       </w:pPr>
       <w:r>
         <w:rPr>
-          <w:rFonts w:ascii="Calibri" w:cs="Calibri" w:eastAsia="Calibri" w:hAnsi="Calibri"/>
-          <w:b w:val="0"/>
-          <w:bCs w:val="0"/>
           <w:i w:val="0"/>
           <w:iCs w:val="0"/>
           <w:smallCaps w:val="0"/>
@@ -4501,6 +4061,7 @@
               <w:ind w:left="107" w:hanging="107"/>
               <w:jc w:val="both"/>
               <w:rPr>
+                <w:rFonts w:ascii="Calibri" w:cs="Calibri" w:eastAsia="Calibri" w:hAnsi="Calibri"/>
                 <w:b w:val="1"/>
                 <w:bCs w:val="1"/>
               </w:rPr>
@@ -4619,7 +4180,9 @@
             <w:pPr>
               <w:spacing w:line="254" w:lineRule="auto"/>
               <w:ind w:left="107" w:hanging="107"/>
-              <w:rPr/>
+              <w:rPr>
+                <w:rFonts w:ascii="Calibri" w:cs="Calibri" w:eastAsia="Calibri" w:hAnsi="Calibri"/>
+              </w:rPr>
             </w:pPr>
             <w:r>
               <w:rPr>
@@ -4720,7 +4283,9 @@
               <w:spacing w:line="252.00000000000003" w:lineRule="auto"/>
               <w:ind w:left="107" w:hanging="107"/>
               <w:jc w:val="both"/>
-              <w:rPr/>
+              <w:rPr>
+                <w:rFonts w:ascii="Calibri" w:cs="Calibri" w:eastAsia="Calibri" w:hAnsi="Calibri"/>
+              </w:rPr>
             </w:pPr>
             <w:r>
               <w:rPr>
@@ -4824,7 +4389,9 @@
               <w:spacing w:line="254" w:lineRule="auto"/>
               <w:ind w:left="107" w:hanging="107"/>
               <w:jc w:val="both"/>
-              <w:rPr/>
+              <w:rPr>
+                <w:rFonts w:ascii="Calibri" w:cs="Calibri" w:eastAsia="Calibri" w:hAnsi="Calibri"/>
+              </w:rPr>
             </w:pPr>
             <w:r>
               <w:rPr>
@@ -4928,7 +4495,9 @@
               <w:spacing w:line="254" w:lineRule="auto"/>
               <w:ind w:left="107" w:hanging="107"/>
               <w:jc w:val="both"/>
-              <w:rPr/>
+              <w:rPr>
+                <w:rFonts w:ascii="Calibri" w:cs="Calibri" w:eastAsia="Calibri" w:hAnsi="Calibri"/>
+              </w:rPr>
             </w:pPr>
             <w:r>
               <w:rPr>
@@ -5359,12 +4928,12 @@
           <wp:inline distB="114300" distT="114300" distL="114300" distR="114300">
             <wp:extent cx="5746440" cy="2514600"/>
             <wp:effectExtent b="0" l="0" r="0" t="0"/>
-            <wp:docPr id="9" name="image5.jpg"/>
+            <wp:docPr id="9" name="image7.jpg"/>
             <a:graphic>
               <a:graphicData uri="http://schemas.openxmlformats.org/drawingml/2006/picture">
                 <pic:pic>
                   <pic:nvPicPr>
-                    <pic:cNvPr id="0" name="image5.jpg"/>
+                    <pic:cNvPr id="0" name="image7.jpg"/>
                     <pic:cNvPicPr preferRelativeResize="0"/>
                   </pic:nvPicPr>
                   <pic:blipFill>
@@ -5436,12 +5005,12 @@
           <wp:inline distB="114300" distT="114300" distL="114300" distR="114300">
             <wp:extent cx="5746440" cy="2387600"/>
             <wp:effectExtent b="0" l="0" r="0" t="0"/>
-            <wp:docPr id="12" name="image2.png"/>
+            <wp:docPr id="12" name="image6.png"/>
             <a:graphic>
               <a:graphicData uri="http://schemas.openxmlformats.org/drawingml/2006/picture">
                 <pic:pic>
                   <pic:nvPicPr>
-                    <pic:cNvPr id="0" name="image2.png"/>
+                    <pic:cNvPr id="0" name="image6.png"/>
                     <pic:cNvPicPr preferRelativeResize="0"/>
                   </pic:nvPicPr>
                   <pic:blipFill>
@@ -5629,12 +5198,12 @@
           <wp:inline distB="114300" distT="114300" distL="114300" distR="114300">
             <wp:extent cx="5746440" cy="1892300"/>
             <wp:effectExtent b="0" l="0" r="0" t="0"/>
-            <wp:docPr id="8" name="image6.png"/>
+            <wp:docPr id="8" name="image2.png"/>
             <a:graphic>
               <a:graphicData uri="http://schemas.openxmlformats.org/drawingml/2006/picture">
                 <pic:pic>
                   <pic:nvPicPr>
-                    <pic:cNvPr id="0" name="image6.png"/>
+                    <pic:cNvPr id="0" name="image2.png"/>
                     <pic:cNvPicPr preferRelativeResize="0"/>
                   </pic:nvPicPr>
                   <pic:blipFill>
@@ -5740,12 +5309,12 @@
           <wp:inline distB="114300" distT="114300" distL="114300" distR="114300">
             <wp:extent cx="5746440" cy="2946400"/>
             <wp:effectExtent b="0" l="0" r="0" t="0"/>
-            <wp:docPr id="7" name="image7.png"/>
+            <wp:docPr id="7" name="image5.png"/>
             <a:graphic>
               <a:graphicData uri="http://schemas.openxmlformats.org/drawingml/2006/picture">
                 <pic:pic>
                   <pic:nvPicPr>
-                    <pic:cNvPr id="0" name="image7.png"/>
+                    <pic:cNvPr id="0" name="image5.png"/>
                     <pic:cNvPicPr preferRelativeResize="0"/>
                   </pic:nvPicPr>
                   <pic:blipFill>
@@ -5896,7 +5465,6 @@
             <w:pPr>
               <w:spacing w:after="0" w:line="240" w:lineRule="auto"/>
               <w:rPr>
-                <w:rFonts w:ascii="Calibri" w:cs="Calibri" w:eastAsia="Calibri" w:hAnsi="Calibri"/>
                 <w:b w:val="1"/>
                 <w:bCs w:val="1"/>
                 <w:i w:val="1"/>
@@ -5908,7 +5476,6 @@
             </w:pPr>
             <w:r>
               <w:rPr>
-                <w:rFonts w:ascii="Calibri" w:cs="Calibri" w:eastAsia="Calibri" w:hAnsi="Calibri"/>
                 <w:b w:val="1"/>
                 <w:bCs w:val="1"/>
                 <w:i w:val="1"/>
@@ -5937,7 +5504,6 @@
             <w:pPr>
               <w:spacing w:after="0" w:line="240" w:lineRule="auto"/>
               <w:rPr>
-                <w:rFonts w:ascii="Calibri" w:cs="Calibri" w:eastAsia="Calibri" w:hAnsi="Calibri"/>
                 <w:color w:val="000000"/>
                 <w:sz w:val="20"/>
                 <w:szCs w:val="20"/>
@@ -5992,7 +5558,6 @@
             <w:pPr>
               <w:spacing w:after="0" w:line="240" w:lineRule="auto"/>
               <w:rPr>
-                <w:rFonts w:ascii="Calibri" w:cs="Calibri" w:eastAsia="Calibri" w:hAnsi="Calibri"/>
                 <w:b w:val="1"/>
                 <w:bCs w:val="1"/>
                 <w:i w:val="1"/>
@@ -6004,7 +5569,6 @@
             </w:pPr>
             <w:r>
               <w:rPr>
-                <w:rFonts w:ascii="Calibri" w:cs="Calibri" w:eastAsia="Calibri" w:hAnsi="Calibri"/>
                 <w:b w:val="1"/>
                 <w:bCs w:val="1"/>
                 <w:i w:val="1"/>
@@ -6033,7 +5597,6 @@
             <w:pPr>
               <w:spacing w:after="0" w:line="240" w:lineRule="auto"/>
               <w:rPr>
-                <w:rFonts w:ascii="Calibri" w:cs="Calibri" w:eastAsia="Calibri" w:hAnsi="Calibri"/>
                 <w:color w:val="000000"/>
                 <w:sz w:val="20"/>
                 <w:szCs w:val="20"/>
@@ -6076,7 +5639,6 @@
             <w:pPr>
               <w:spacing w:after="0" w:line="240" w:lineRule="auto"/>
               <w:rPr>
-                <w:rFonts w:ascii="Calibri" w:cs="Calibri" w:eastAsia="Calibri" w:hAnsi="Calibri"/>
                 <w:b w:val="1"/>
                 <w:bCs w:val="1"/>
                 <w:i w:val="1"/>
@@ -6088,7 +5650,6 @@
             </w:pPr>
             <w:r>
               <w:rPr>
-                <w:rFonts w:ascii="Calibri" w:cs="Calibri" w:eastAsia="Calibri" w:hAnsi="Calibri"/>
                 <w:b w:val="1"/>
                 <w:bCs w:val="1"/>
                 <w:i w:val="1"/>
@@ -6117,7 +5678,6 @@
             <w:pPr>
               <w:spacing w:after="0" w:line="240" w:lineRule="auto"/>
               <w:rPr>
-                <w:rFonts w:ascii="Calibri" w:cs="Calibri" w:eastAsia="Calibri" w:hAnsi="Calibri"/>
                 <w:color w:val="000000"/>
                 <w:sz w:val="20"/>
                 <w:szCs w:val="20"/>
@@ -6160,7 +5720,6 @@
             <w:pPr>
               <w:spacing w:after="0" w:line="240" w:lineRule="auto"/>
               <w:rPr>
-                <w:rFonts w:ascii="Calibri" w:cs="Calibri" w:eastAsia="Calibri" w:hAnsi="Calibri"/>
                 <w:b w:val="1"/>
                 <w:bCs w:val="1"/>
                 <w:i w:val="1"/>
@@ -6172,7 +5731,6 @@
             </w:pPr>
             <w:r>
               <w:rPr>
-                <w:rFonts w:ascii="Calibri" w:cs="Calibri" w:eastAsia="Calibri" w:hAnsi="Calibri"/>
                 <w:b w:val="1"/>
                 <w:bCs w:val="1"/>
                 <w:i w:val="1"/>
@@ -6201,7 +5759,6 @@
             <w:pPr>
               <w:spacing w:after="0" w:line="240" w:lineRule="auto"/>
               <w:rPr>
-                <w:rFonts w:ascii="Calibri" w:cs="Calibri" w:eastAsia="Calibri" w:hAnsi="Calibri"/>
                 <w:color w:val="000000"/>
                 <w:sz w:val="20"/>
                 <w:szCs w:val="20"/>
@@ -6244,7 +5801,6 @@
             <w:pPr>
               <w:spacing w:after="0" w:line="240" w:lineRule="auto"/>
               <w:rPr>
-                <w:rFonts w:ascii="Calibri" w:cs="Calibri" w:eastAsia="Calibri" w:hAnsi="Calibri"/>
                 <w:b w:val="1"/>
                 <w:bCs w:val="1"/>
                 <w:i w:val="1"/>
@@ -6256,7 +5812,6 @@
             </w:pPr>
             <w:r>
               <w:rPr>
-                <w:rFonts w:ascii="Calibri" w:cs="Calibri" w:eastAsia="Calibri" w:hAnsi="Calibri"/>
                 <w:b w:val="1"/>
                 <w:bCs w:val="1"/>
                 <w:i w:val="1"/>
@@ -6285,7 +5840,6 @@
             <w:pPr>
               <w:spacing w:after="0" w:line="240" w:lineRule="auto"/>
               <w:rPr>
-                <w:rFonts w:ascii="Calibri" w:cs="Calibri" w:eastAsia="Calibri" w:hAnsi="Calibri"/>
                 <w:color w:val="000000"/>
                 <w:sz w:val="20"/>
                 <w:szCs w:val="20"/>
@@ -6328,7 +5882,6 @@
             <w:pPr>
               <w:spacing w:after="0" w:line="240" w:lineRule="auto"/>
               <w:rPr>
-                <w:rFonts w:ascii="Calibri" w:cs="Calibri" w:eastAsia="Calibri" w:hAnsi="Calibri"/>
                 <w:b w:val="1"/>
                 <w:bCs w:val="1"/>
                 <w:i w:val="1"/>
@@ -6340,7 +5893,6 @@
             </w:pPr>
             <w:r>
               <w:rPr>
-                <w:rFonts w:ascii="Calibri" w:cs="Calibri" w:eastAsia="Calibri" w:hAnsi="Calibri"/>
                 <w:b w:val="1"/>
                 <w:bCs w:val="1"/>
                 <w:i w:val="1"/>
@@ -6386,7 +5938,6 @@
             <w:pPr>
               <w:spacing w:after="0" w:line="240" w:lineRule="auto"/>
               <w:rPr>
-                <w:rFonts w:ascii="Calibri" w:cs="Calibri" w:eastAsia="Calibri" w:hAnsi="Calibri"/>
                 <w:color w:val="000000"/>
                 <w:sz w:val="20"/>
                 <w:szCs w:val="20"/>
@@ -6656,7 +6207,6 @@
             <w:pPr>
               <w:spacing w:after="0" w:line="240" w:lineRule="auto"/>
               <w:rPr>
-                <w:rFonts w:ascii="Calibri" w:cs="Calibri" w:eastAsia="Calibri" w:hAnsi="Calibri"/>
                 <w:b w:val="1"/>
                 <w:bCs w:val="1"/>
                 <w:i w:val="1"/>
@@ -6668,7 +6218,6 @@
             </w:pPr>
             <w:r>
               <w:rPr>
-                <w:rFonts w:ascii="Calibri" w:cs="Calibri" w:eastAsia="Calibri" w:hAnsi="Calibri"/>
                 <w:b w:val="1"/>
                 <w:bCs w:val="1"/>
                 <w:i w:val="1"/>
@@ -6697,7 +6246,6 @@
             <w:pPr>
               <w:spacing w:after="0" w:line="240" w:lineRule="auto"/>
               <w:rPr>
-                <w:rFonts w:ascii="Calibri" w:cs="Calibri" w:eastAsia="Calibri" w:hAnsi="Calibri"/>
                 <w:color w:val="000000"/>
                 <w:sz w:val="20"/>
                 <w:szCs w:val="20"/>
@@ -6740,7 +6288,6 @@
             <w:pPr>
               <w:spacing w:after="0" w:line="240" w:lineRule="auto"/>
               <w:rPr>
-                <w:rFonts w:ascii="Calibri" w:cs="Calibri" w:eastAsia="Calibri" w:hAnsi="Calibri"/>
                 <w:b w:val="1"/>
                 <w:bCs w:val="1"/>
                 <w:i w:val="1"/>
@@ -6752,7 +6299,6 @@
             </w:pPr>
             <w:r>
               <w:rPr>
-                <w:rFonts w:ascii="Calibri" w:cs="Calibri" w:eastAsia="Calibri" w:hAnsi="Calibri"/>
                 <w:b w:val="1"/>
                 <w:bCs w:val="1"/>
                 <w:i w:val="1"/>
@@ -6781,7 +6327,6 @@
             <w:pPr>
               <w:spacing w:after="0" w:line="240" w:lineRule="auto"/>
               <w:rPr>
-                <w:rFonts w:ascii="Calibri" w:cs="Calibri" w:eastAsia="Calibri" w:hAnsi="Calibri"/>
                 <w:color w:val="000000"/>
                 <w:sz w:val="20"/>
                 <w:szCs w:val="20"/>
@@ -6824,7 +6369,6 @@
             <w:pPr>
               <w:spacing w:after="0" w:line="240" w:lineRule="auto"/>
               <w:rPr>
-                <w:rFonts w:ascii="Calibri" w:cs="Calibri" w:eastAsia="Calibri" w:hAnsi="Calibri"/>
                 <w:b w:val="1"/>
                 <w:bCs w:val="1"/>
                 <w:i w:val="1"/>
@@ -6836,7 +6380,6 @@
             </w:pPr>
             <w:r>
               <w:rPr>
-                <w:rFonts w:ascii="Calibri" w:cs="Calibri" w:eastAsia="Calibri" w:hAnsi="Calibri"/>
                 <w:b w:val="1"/>
                 <w:bCs w:val="1"/>
                 <w:i w:val="1"/>
@@ -6865,7 +6408,6 @@
             <w:pPr>
               <w:spacing w:after="0" w:line="240" w:lineRule="auto"/>
               <w:rPr>
-                <w:rFonts w:ascii="Calibri" w:cs="Calibri" w:eastAsia="Calibri" w:hAnsi="Calibri"/>
                 <w:color w:val="000000"/>
                 <w:sz w:val="20"/>
                 <w:szCs w:val="20"/>
@@ -6908,7 +6450,6 @@
             <w:pPr>
               <w:spacing w:after="0" w:line="240" w:lineRule="auto"/>
               <w:rPr>
-                <w:rFonts w:ascii="Calibri" w:cs="Calibri" w:eastAsia="Calibri" w:hAnsi="Calibri"/>
                 <w:b w:val="1"/>
                 <w:bCs w:val="1"/>
                 <w:i w:val="1"/>
@@ -6920,7 +6461,6 @@
             </w:pPr>
             <w:r>
               <w:rPr>
-                <w:rFonts w:ascii="Calibri" w:cs="Calibri" w:eastAsia="Calibri" w:hAnsi="Calibri"/>
                 <w:b w:val="1"/>
                 <w:bCs w:val="1"/>
                 <w:i w:val="1"/>
@@ -6949,7 +6489,6 @@
             <w:pPr>
               <w:spacing w:after="0" w:line="240" w:lineRule="auto"/>
               <w:rPr>
-                <w:rFonts w:ascii="Calibri" w:cs="Calibri" w:eastAsia="Calibri" w:hAnsi="Calibri"/>
                 <w:color w:val="000000"/>
                 <w:sz w:val="20"/>
                 <w:szCs w:val="20"/>
@@ -6992,7 +6531,6 @@
             <w:pPr>
               <w:spacing w:after="0" w:line="240" w:lineRule="auto"/>
               <w:rPr>
-                <w:rFonts w:ascii="Calibri" w:cs="Calibri" w:eastAsia="Calibri" w:hAnsi="Calibri"/>
                 <w:b w:val="1"/>
                 <w:bCs w:val="1"/>
                 <w:i w:val="1"/>
@@ -7004,7 +6542,6 @@
             </w:pPr>
             <w:r>
               <w:rPr>
-                <w:rFonts w:ascii="Calibri" w:cs="Calibri" w:eastAsia="Calibri" w:hAnsi="Calibri"/>
                 <w:b w:val="1"/>
                 <w:bCs w:val="1"/>
                 <w:i w:val="1"/>
@@ -7033,7 +6570,6 @@
             <w:pPr>
               <w:spacing w:after="0" w:line="240" w:lineRule="auto"/>
               <w:rPr>
-                <w:rFonts w:ascii="Calibri" w:cs="Calibri" w:eastAsia="Calibri" w:hAnsi="Calibri"/>
                 <w:color w:val="000000"/>
                 <w:sz w:val="20"/>
                 <w:szCs w:val="20"/>
@@ -10134,7 +9670,6 @@
             <w:pPr>
               <w:spacing w:after="0" w:line="240" w:lineRule="auto"/>
               <w:rPr>
-                <w:rFonts w:ascii="Calibri" w:cs="Calibri" w:eastAsia="Calibri" w:hAnsi="Calibri"/>
                 <w:b w:val="1"/>
                 <w:bCs w:val="1"/>
                 <w:color w:val="000000"/>
@@ -10144,7 +9679,6 @@
             </w:pPr>
             <w:r>
               <w:rPr>
-                <w:rFonts w:ascii="Calibri" w:cs="Calibri" w:eastAsia="Calibri" w:hAnsi="Calibri"/>
                 <w:b w:val="1"/>
                 <w:bCs w:val="1"/>
                 <w:color w:val="000000"/>
@@ -10170,7 +9704,6 @@
             <w:pPr>
               <w:spacing w:after="0" w:line="240" w:lineRule="auto"/>
               <w:rPr>
-                <w:rFonts w:ascii="Calibri" w:cs="Calibri" w:eastAsia="Calibri" w:hAnsi="Calibri"/>
                 <w:b w:val="1"/>
                 <w:bCs w:val="1"/>
                 <w:color w:val="000000"/>
@@ -10180,7 +9713,6 @@
             </w:pPr>
             <w:r>
               <w:rPr>
-                <w:rFonts w:ascii="Calibri" w:cs="Calibri" w:eastAsia="Calibri" w:hAnsi="Calibri"/>
                 <w:b w:val="1"/>
                 <w:bCs w:val="1"/>
                 <w:color w:val="000000"/>
@@ -10206,7 +9738,6 @@
             <w:pPr>
               <w:spacing w:after="0" w:line="240" w:lineRule="auto"/>
               <w:rPr>
-                <w:rFonts w:ascii="Calibri" w:cs="Calibri" w:eastAsia="Calibri" w:hAnsi="Calibri"/>
                 <w:b w:val="1"/>
                 <w:bCs w:val="1"/>
                 <w:color w:val="000000"/>
@@ -10216,7 +9747,6 @@
             </w:pPr>
             <w:r>
               <w:rPr>
-                <w:rFonts w:ascii="Calibri" w:cs="Calibri" w:eastAsia="Calibri" w:hAnsi="Calibri"/>
                 <w:b w:val="1"/>
                 <w:bCs w:val="1"/>
                 <w:color w:val="000000"/>
@@ -10242,7 +9772,6 @@
             <w:pPr>
               <w:spacing w:after="0" w:line="240" w:lineRule="auto"/>
               <w:rPr>
-                <w:rFonts w:ascii="Calibri" w:cs="Calibri" w:eastAsia="Calibri" w:hAnsi="Calibri"/>
                 <w:b w:val="1"/>
                 <w:bCs w:val="1"/>
                 <w:color w:val="000000"/>
@@ -10252,7 +9781,6 @@
             </w:pPr>
             <w:r>
               <w:rPr>
-                <w:rFonts w:ascii="Calibri" w:cs="Calibri" w:eastAsia="Calibri" w:hAnsi="Calibri"/>
                 <w:b w:val="1"/>
                 <w:bCs w:val="1"/>
                 <w:color w:val="000000"/>
@@ -10285,15 +9813,13 @@
             <w:pPr>
               <w:spacing w:after="0" w:line="240" w:lineRule="auto"/>
               <w:rPr>
-                <w:rFonts w:ascii="Calibri" w:cs="Calibri" w:eastAsia="Calibri" w:hAnsi="Calibri"/>
-                <w:color w:val="000000"/>
-                <w:sz w:val="20"/>
-                <w:szCs w:val="20"/>
-              </w:rPr>
-            </w:pPr>
-            <w:r>
-              <w:rPr>
-                <w:rFonts w:ascii="Calibri" w:cs="Calibri" w:eastAsia="Calibri" w:hAnsi="Calibri"/>
+                <w:color w:val="000000"/>
+                <w:sz w:val="20"/>
+                <w:szCs w:val="20"/>
+              </w:rPr>
+            </w:pPr>
+            <w:r>
+              <w:rPr>
                 <w:color w:val="000000"/>
                 <w:sz w:val="20"/>
                 <w:szCs w:val="20"/>
@@ -10317,7 +9843,6 @@
             <w:pPr>
               <w:spacing w:after="0" w:lineRule="auto"/>
               <w:rPr>
-                <w:rFonts w:ascii="Calibri" w:cs="Calibri" w:eastAsia="Calibri" w:hAnsi="Calibri"/>
                 <w:color w:val="000000"/>
                 <w:sz w:val="20"/>
                 <w:szCs w:val="20"/>
@@ -10350,19 +9875,18 @@
             <w:pPr>
               <w:spacing w:after="0" w:line="240" w:lineRule="auto"/>
               <w:rPr>
-                <w:rFonts w:ascii="Calibri" w:cs="Calibri" w:eastAsia="Calibri" w:hAnsi="Calibri"/>
-                <w:color w:val="000000"/>
-                <w:sz w:val="20"/>
-                <w:szCs w:val="20"/>
-              </w:rPr>
-            </w:pPr>
-            <w:r>
-              <w:rPr>
-                <w:sz w:val="20"/>
-                <w:szCs w:val="20"/>
-                <w:rtl w:val="0"/>
-              </w:rPr>
-              <w:t xml:space="preserve">GCMB manages user accounts, role-based access, password recovery, and audit logs for the four business roles: Head Office Manager, Branch Manager, Receptionist, and Accountant. It also supports branch setup, room categories, time-based pricing, combo packages, and room records, with administrative actions restricted according to each role’s authority. </w:t>
+                <w:color w:val="000000"/>
+                <w:sz w:val="20"/>
+                <w:szCs w:val="20"/>
+              </w:rPr>
+            </w:pPr>
+            <w:r>
+              <w:rPr>
+                <w:sz w:val="20"/>
+                <w:szCs w:val="20"/>
+                <w:rtl w:val="0"/>
+              </w:rPr>
+              <w:t xml:space="preserve">GCMB manages user accounts, role-based access, password recovery, and audit logs for the four business roles: Head Office Manager, Branch Manager, Receptionist, and Accountant. It also supports branch setup and Branch Manager assignments, with administrative actions restricted according to each role’s authority and permitted branch scope. </w:t>
             </w:r>
             <w:r>
               <w:rPr>
@@ -10385,7 +9909,6 @@
             <w:pPr>
               <w:spacing w:after="0" w:line="240" w:lineRule="auto"/>
               <w:rPr>
-                <w:rFonts w:ascii="Calibri" w:cs="Calibri" w:eastAsia="Calibri" w:hAnsi="Calibri"/>
                 <w:color w:val="000000"/>
                 <w:sz w:val="20"/>
                 <w:szCs w:val="20"/>
@@ -10427,15 +9950,13 @@
             <w:pPr>
               <w:spacing w:after="0" w:line="240" w:lineRule="auto"/>
               <w:rPr>
-                <w:rFonts w:ascii="Calibri" w:cs="Calibri" w:eastAsia="Calibri" w:hAnsi="Calibri"/>
-                <w:color w:val="000000"/>
-                <w:sz w:val="20"/>
-                <w:szCs w:val="20"/>
-              </w:rPr>
-            </w:pPr>
-            <w:r>
-              <w:rPr>
-                <w:rFonts w:ascii="Calibri" w:cs="Calibri" w:eastAsia="Calibri" w:hAnsi="Calibri"/>
+                <w:color w:val="000000"/>
+                <w:sz w:val="20"/>
+                <w:szCs w:val="20"/>
+              </w:rPr>
+            </w:pPr>
+            <w:r>
+              <w:rPr>
                 <w:color w:val="000000"/>
                 <w:sz w:val="20"/>
                 <w:szCs w:val="20"/>
@@ -10459,7 +9980,6 @@
             <w:pPr>
               <w:spacing w:after="0" w:lineRule="auto"/>
               <w:rPr>
-                <w:rFonts w:ascii="Calibri" w:cs="Calibri" w:eastAsia="Calibri" w:hAnsi="Calibri"/>
                 <w:color w:val="000000"/>
                 <w:sz w:val="20"/>
                 <w:szCs w:val="20"/>
@@ -10494,19 +10014,18 @@
             <w:pPr>
               <w:spacing w:after="0" w:line="240" w:lineRule="auto"/>
               <w:rPr>
-                <w:rFonts w:ascii="Calibri" w:cs="Calibri" w:eastAsia="Calibri" w:hAnsi="Calibri"/>
-                <w:color w:val="000000"/>
-                <w:sz w:val="20"/>
-                <w:szCs w:val="20"/>
-              </w:rPr>
-            </w:pPr>
-            <w:r>
-              <w:rPr>
-                <w:sz w:val="20"/>
-                <w:szCs w:val="20"/>
-                <w:rtl w:val="0"/>
-              </w:rPr>
-              <w:t xml:space="preserve">GCMB records walk-in and advance bookings entered by Receptionists, and supports booking updates, cancellation, check-in, room changes, stay extensions, and no-show handling. It tracks room status, records booking deposits and eligible refunds, and generates checkout bills that account for room charges, overtime, food and beverage, service charges, deposits, and manually entered discounts. Payments can be recorded as cash or confirmed QR payments. </w:t>
+                <w:color w:val="000000"/>
+                <w:sz w:val="20"/>
+                <w:szCs w:val="20"/>
+              </w:rPr>
+            </w:pPr>
+            <w:r>
+              <w:rPr>
+                <w:sz w:val="20"/>
+                <w:szCs w:val="20"/>
+                <w:rtl w:val="0"/>
+              </w:rPr>
+              <w:t xml:space="preserve">GCMB manages room types, time-based room prices, combo packages, room records, and room operating status. It records walk-in and advance bookings entered by Receptionists and supports booking updates, cancellation, check-in, room changes, stay extensions, and no-show handling. It manages the food and beverage menu and links orders to active room bookings. It also records booking deposits and eligible refunds and generates checkout bills covering room charges, overtime, food and beverage, service charges, deposits, and manually entered discounts. Payments can be recorded as cash or confirmed QR payments. </w:t>
             </w:r>
             <w:r>
               <w:rPr>
@@ -10529,7 +10048,6 @@
             <w:pPr>
               <w:spacing w:after="0" w:line="240" w:lineRule="auto"/>
               <w:rPr>
-                <w:rFonts w:ascii="Calibri" w:cs="Calibri" w:eastAsia="Calibri" w:hAnsi="Calibri"/>
                 <w:color w:val="000000"/>
                 <w:sz w:val="20"/>
                 <w:szCs w:val="20"/>
@@ -10571,15 +10089,13 @@
             <w:pPr>
               <w:spacing w:after="0" w:line="240" w:lineRule="auto"/>
               <w:rPr>
-                <w:rFonts w:ascii="Calibri" w:cs="Calibri" w:eastAsia="Calibri" w:hAnsi="Calibri"/>
-                <w:color w:val="000000"/>
-                <w:sz w:val="20"/>
-                <w:szCs w:val="20"/>
-              </w:rPr>
-            </w:pPr>
-            <w:r>
-              <w:rPr>
-                <w:rFonts w:ascii="Calibri" w:cs="Calibri" w:eastAsia="Calibri" w:hAnsi="Calibri"/>
+                <w:color w:val="000000"/>
+                <w:sz w:val="20"/>
+                <w:szCs w:val="20"/>
+              </w:rPr>
+            </w:pPr>
+            <w:r>
+              <w:rPr>
                 <w:color w:val="000000"/>
                 <w:sz w:val="20"/>
                 <w:szCs w:val="20"/>
@@ -10637,19 +10153,18 @@
             <w:pPr>
               <w:spacing w:after="0" w:line="240" w:lineRule="auto"/>
               <w:rPr>
-                <w:rFonts w:ascii="Calibri" w:cs="Calibri" w:eastAsia="Calibri" w:hAnsi="Calibri"/>
-                <w:color w:val="000000"/>
-                <w:sz w:val="20"/>
-                <w:szCs w:val="20"/>
-              </w:rPr>
-            </w:pPr>
-            <w:r>
-              <w:rPr>
-                <w:sz w:val="20"/>
-                <w:szCs w:val="20"/>
-                <w:rtl w:val="0"/>
-              </w:rPr>
-              <w:t xml:space="preserve">GCMB manages the menu and links food and beverage orders to an active room booking. It tracks inventory levels and stock movements, including receipts, sales deductions, and reason-recorded adjustments. The system also records equipment assets and incidents, supports repair planning and outcome tracking, and manages purchase or replacement proposals and approvals. </w:t>
+                <w:color w:val="000000"/>
+                <w:sz w:val="20"/>
+                <w:szCs w:val="20"/>
+              </w:rPr>
+            </w:pPr>
+            <w:r>
+              <w:rPr>
+                <w:sz w:val="20"/>
+                <w:szCs w:val="20"/>
+                <w:rtl w:val="0"/>
+              </w:rPr>
+              <w:t xml:space="preserve">GCMB tracks inventory levels and stock movements, including receipts, sales deductions, and adjustments with recorded reasons. It manages equipment categories and assets, records equipment incidents, and supports incident assessment, repair planning, repair outcome tracking, and cross-branch equipment transfers with handover and receipt confirmations. Purchase or replacement payment requests and approvals are handled under Business Performance Management. </w:t>
             </w:r>
             <w:r>
               <w:rPr>
@@ -10672,7 +10187,6 @@
             <w:pPr>
               <w:spacing w:after="0" w:line="240" w:lineRule="auto"/>
               <w:rPr>
-                <w:rFonts w:ascii="Calibri" w:cs="Calibri" w:eastAsia="Calibri" w:hAnsi="Calibri"/>
                 <w:color w:val="000000"/>
                 <w:sz w:val="20"/>
                 <w:szCs w:val="20"/>
@@ -10714,15 +10228,13 @@
             <w:pPr>
               <w:spacing w:after="0" w:line="240" w:lineRule="auto"/>
               <w:rPr>
-                <w:rFonts w:ascii="Calibri" w:cs="Calibri" w:eastAsia="Calibri" w:hAnsi="Calibri"/>
-                <w:color w:val="000000"/>
-                <w:sz w:val="20"/>
-                <w:szCs w:val="20"/>
-              </w:rPr>
-            </w:pPr>
-            <w:r>
-              <w:rPr>
-                <w:rFonts w:ascii="Calibri" w:cs="Calibri" w:eastAsia="Calibri" w:hAnsi="Calibri"/>
+                <w:color w:val="000000"/>
+                <w:sz w:val="20"/>
+                <w:szCs w:val="20"/>
+              </w:rPr>
+            </w:pPr>
+            <w:r>
+              <w:rPr>
                 <w:color w:val="000000"/>
                 <w:sz w:val="20"/>
                 <w:szCs w:val="20"/>
@@ -10746,7 +10258,6 @@
             <w:pPr>
               <w:spacing w:after="0" w:lineRule="auto"/>
               <w:rPr>
-                <w:rFonts w:ascii="Calibri" w:cs="Calibri" w:eastAsia="Calibri" w:hAnsi="Calibri"/>
                 <w:color w:val="000000"/>
                 <w:sz w:val="20"/>
                 <w:szCs w:val="20"/>
@@ -10779,7 +10290,6 @@
             <w:pPr>
               <w:spacing w:after="0" w:line="240" w:lineRule="auto"/>
               <w:rPr>
-                <w:rFonts w:ascii="Calibri" w:cs="Calibri" w:eastAsia="Calibri" w:hAnsi="Calibri"/>
                 <w:color w:val="000000"/>
                 <w:sz w:val="20"/>
                 <w:szCs w:val="20"/>
@@ -10814,7 +10324,6 @@
             <w:pPr>
               <w:spacing w:after="0" w:line="240" w:lineRule="auto"/>
               <w:rPr>
-                <w:rFonts w:ascii="Calibri" w:cs="Calibri" w:eastAsia="Calibri" w:hAnsi="Calibri"/>
                 <w:color w:val="000000"/>
                 <w:sz w:val="20"/>
                 <w:szCs w:val="20"/>
@@ -10856,15 +10365,13 @@
             <w:pPr>
               <w:spacing w:after="0" w:line="240" w:lineRule="auto"/>
               <w:rPr>
-                <w:rFonts w:ascii="Calibri" w:cs="Calibri" w:eastAsia="Calibri" w:hAnsi="Calibri"/>
-                <w:color w:val="000000"/>
-                <w:sz w:val="20"/>
-                <w:szCs w:val="20"/>
-              </w:rPr>
-            </w:pPr>
-            <w:r>
-              <w:rPr>
-                <w:rFonts w:ascii="Calibri" w:cs="Calibri" w:eastAsia="Calibri" w:hAnsi="Calibri"/>
+                <w:color w:val="000000"/>
+                <w:sz w:val="20"/>
+                <w:szCs w:val="20"/>
+              </w:rPr>
+            </w:pPr>
+            <w:r>
+              <w:rPr>
                 <w:color w:val="000000"/>
                 <w:sz w:val="20"/>
                 <w:szCs w:val="20"/>
@@ -10922,7 +10429,6 @@
             <w:pPr>
               <w:spacing w:after="0" w:line="240" w:lineRule="auto"/>
               <w:rPr>
-                <w:rFonts w:ascii="Calibri" w:cs="Calibri" w:eastAsia="Calibri" w:hAnsi="Calibri"/>
                 <w:color w:val="000000"/>
                 <w:sz w:val="20"/>
                 <w:szCs w:val="20"/>
@@ -10957,7 +10463,6 @@
             <w:pPr>
               <w:spacing w:after="0" w:line="240" w:lineRule="auto"/>
               <w:rPr>
-                <w:rFonts w:ascii="Calibri" w:cs="Calibri" w:eastAsia="Calibri" w:hAnsi="Calibri"/>
                 <w:color w:val="000000"/>
                 <w:sz w:val="20"/>
                 <w:szCs w:val="20"/>
@@ -10982,9 +10487,11 @@
     </w:tbl>
     <w:p>
       <w:pPr>
-        <w:jc w:val="both"/>
+        <w:pStyle w:val="Heading2"/>
         <w:rPr/>
       </w:pPr>
+      <w:bookmarkStart w:colFirst="0" w:colLast="0" w:name="_heading=h.ak5qcuqzkvye" w:id="21"/>
+      <w:bookmarkEnd w:id="21"/>
       <w:r>
         <w:rPr>
           <w:rtl w:val="0"/>
@@ -10996,71 +10503,14 @@
         <w:pStyle w:val="Heading2"/>
         <w:rPr/>
       </w:pPr>
-      <w:bookmarkStart w:colFirst="0" w:colLast="0" w:name="_heading=h.gkbgyiv9ft9n" w:id="21"/>
-      <w:bookmarkEnd w:id="21"/>
+      <w:bookmarkStart w:colFirst="0" w:colLast="0" w:name="_heading=h.abf702ut2f2p" w:id="22"/>
+      <w:bookmarkEnd w:id="22"/>
       <w:r>
         <w:rPr>
           <w:rtl w:val="0"/>
         </w:rPr>
-      </w:r>
-    </w:p>
-    <w:p>
-      <w:pPr>
-        <w:pStyle w:val="Heading2"/>
-        <w:rPr/>
-      </w:pPr>
-      <w:bookmarkStart w:colFirst="0" w:colLast="0" w:name="_heading=h.vh9m19w04j6q" w:id="22"/>
-      <w:bookmarkEnd w:id="22"/>
-      <w:r>
-        <w:rPr>
-          <w:rtl w:val="0"/>
-        </w:rPr>
-      </w:r>
-    </w:p>
-    <w:p>
-      <w:pPr>
-        <w:pStyle w:val="Heading2"/>
-        <w:rPr/>
-      </w:pPr>
-      <w:bookmarkStart w:colFirst="0" w:colLast="0" w:name="_heading=h.db9b81aksu40" w:id="23"/>
-      <w:bookmarkEnd w:id="23"/>
-      <w:r>
-        <w:rPr>
-          <w:rtl w:val="0"/>
-        </w:rPr>
-      </w:r>
-    </w:p>
-    <w:p>
-      <w:pPr>
-        <w:pStyle w:val="Heading2"/>
-        <w:rPr/>
-      </w:pPr>
-      <w:bookmarkStart w:colFirst="0" w:colLast="0" w:name="_heading=h.ak5qcuqzkvye" w:id="24"/>
-      <w:bookmarkEnd w:id="24"/>
-      <w:r>
-        <w:rPr>
-          <w:rtl w:val="0"/>
-        </w:rPr>
-      </w:r>
-    </w:p>
-    <w:p>
-      <w:pPr>
-        <w:pStyle w:val="Heading2"/>
-        <w:rPr/>
-      </w:pPr>
-      <w:bookmarkStart w:colFirst="0" w:colLast="0" w:name="_heading=h.abf702ut2f2p" w:id="25"/>
-      <w:bookmarkEnd w:id="25"/>
-      <w:r>
-        <w:rPr>
-          <w:rtl w:val="0"/>
-        </w:rPr>
         <w:t xml:space="preserve">2. Limitations &amp; Exclusions</w:t>
       </w:r>
-    </w:p>
-    <w:p>
-      <w:pPr>
-        <w:rPr/>
-      </w:pPr>
       <w:r>
         <w:rPr>
           <w:rtl w:val="0"/>
@@ -11107,7 +10557,6 @@
             <w:pPr>
               <w:spacing w:after="0" w:line="240" w:lineRule="auto"/>
               <w:rPr>
-                <w:rFonts w:ascii="Calibri" w:cs="Calibri" w:eastAsia="Calibri" w:hAnsi="Calibri"/>
                 <w:b w:val="1"/>
                 <w:bCs w:val="1"/>
                 <w:color w:val="000000"/>
@@ -11117,7 +10566,6 @@
             </w:pPr>
             <w:r>
               <w:rPr>
-                <w:rFonts w:ascii="Calibri" w:cs="Calibri" w:eastAsia="Calibri" w:hAnsi="Calibri"/>
                 <w:b w:val="1"/>
                 <w:bCs w:val="1"/>
                 <w:color w:val="000000"/>
@@ -11143,7 +10591,6 @@
             <w:pPr>
               <w:spacing w:after="0" w:line="240" w:lineRule="auto"/>
               <w:rPr>
-                <w:rFonts w:ascii="Calibri" w:cs="Calibri" w:eastAsia="Calibri" w:hAnsi="Calibri"/>
                 <w:b w:val="1"/>
                 <w:bCs w:val="1"/>
                 <w:color w:val="000000"/>
@@ -11153,7 +10600,6 @@
             </w:pPr>
             <w:r>
               <w:rPr>
-                <w:rFonts w:ascii="Calibri" w:cs="Calibri" w:eastAsia="Calibri" w:hAnsi="Calibri"/>
                 <w:b w:val="1"/>
                 <w:bCs w:val="1"/>
                 <w:color w:val="000000"/>
@@ -11179,7 +10625,6 @@
             <w:pPr>
               <w:spacing w:after="0" w:line="240" w:lineRule="auto"/>
               <w:rPr>
-                <w:rFonts w:ascii="Calibri" w:cs="Calibri" w:eastAsia="Calibri" w:hAnsi="Calibri"/>
                 <w:b w:val="1"/>
                 <w:bCs w:val="1"/>
                 <w:color w:val="000000"/>
@@ -11189,7 +10634,6 @@
             </w:pPr>
             <w:r>
               <w:rPr>
-                <w:rFonts w:ascii="Calibri" w:cs="Calibri" w:eastAsia="Calibri" w:hAnsi="Calibri"/>
                 <w:b w:val="1"/>
                 <w:bCs w:val="1"/>
                 <w:color w:val="000000"/>
@@ -11222,15 +10666,13 @@
             <w:pPr>
               <w:spacing w:after="0" w:line="240" w:lineRule="auto"/>
               <w:rPr>
-                <w:rFonts w:ascii="Calibri" w:cs="Calibri" w:eastAsia="Calibri" w:hAnsi="Calibri"/>
-                <w:color w:val="000000"/>
-                <w:sz w:val="20"/>
-                <w:szCs w:val="20"/>
-              </w:rPr>
-            </w:pPr>
-            <w:r>
-              <w:rPr>
-                <w:rFonts w:ascii="Calibri" w:cs="Calibri" w:eastAsia="Calibri" w:hAnsi="Calibri"/>
+                <w:color w:val="000000"/>
+                <w:sz w:val="20"/>
+                <w:szCs w:val="20"/>
+              </w:rPr>
+            </w:pPr>
+            <w:r>
+              <w:rPr>
                 <w:color w:val="000000"/>
                 <w:sz w:val="20"/>
                 <w:szCs w:val="20"/>
@@ -11254,7 +10696,6 @@
             <w:pPr>
               <w:spacing w:after="0" w:line="240" w:lineRule="auto"/>
               <w:rPr>
-                <w:rFonts w:ascii="Calibri" w:cs="Calibri" w:eastAsia="Calibri" w:hAnsi="Calibri"/>
                 <w:color w:val="000000"/>
                 <w:sz w:val="20"/>
                 <w:szCs w:val="20"/>
@@ -11289,7 +10730,6 @@
             <w:pPr>
               <w:spacing w:after="0" w:line="240" w:lineRule="auto"/>
               <w:rPr>
-                <w:rFonts w:ascii="Calibri" w:cs="Calibri" w:eastAsia="Calibri" w:hAnsi="Calibri"/>
                 <w:color w:val="000000"/>
                 <w:sz w:val="20"/>
                 <w:szCs w:val="20"/>
@@ -11331,15 +10771,13 @@
             <w:pPr>
               <w:spacing w:after="0" w:line="240" w:lineRule="auto"/>
               <w:rPr>
-                <w:rFonts w:ascii="Calibri" w:cs="Calibri" w:eastAsia="Calibri" w:hAnsi="Calibri"/>
-                <w:color w:val="000000"/>
-                <w:sz w:val="20"/>
-                <w:szCs w:val="20"/>
-              </w:rPr>
-            </w:pPr>
-            <w:r>
-              <w:rPr>
-                <w:rFonts w:ascii="Calibri" w:cs="Calibri" w:eastAsia="Calibri" w:hAnsi="Calibri"/>
+                <w:color w:val="000000"/>
+                <w:sz w:val="20"/>
+                <w:szCs w:val="20"/>
+              </w:rPr>
+            </w:pPr>
+            <w:r>
+              <w:rPr>
                 <w:color w:val="000000"/>
                 <w:sz w:val="20"/>
                 <w:szCs w:val="20"/>
@@ -11363,7 +10801,6 @@
             <w:pPr>
               <w:spacing w:after="0" w:line="240" w:lineRule="auto"/>
               <w:rPr>
-                <w:rFonts w:ascii="Calibri" w:cs="Calibri" w:eastAsia="Calibri" w:hAnsi="Calibri"/>
                 <w:color w:val="000000"/>
                 <w:sz w:val="20"/>
                 <w:szCs w:val="20"/>
@@ -11398,7 +10835,6 @@
             <w:pPr>
               <w:spacing w:after="0" w:line="240" w:lineRule="auto"/>
               <w:rPr>
-                <w:rFonts w:ascii="Calibri" w:cs="Calibri" w:eastAsia="Calibri" w:hAnsi="Calibri"/>
                 <w:color w:val="000000"/>
                 <w:sz w:val="20"/>
                 <w:szCs w:val="20"/>
@@ -11440,7 +10876,6 @@
             <w:pPr>
               <w:spacing w:after="0" w:line="240" w:lineRule="auto"/>
               <w:rPr>
-                <w:rFonts w:ascii="Calibri" w:cs="Calibri" w:eastAsia="Calibri" w:hAnsi="Calibri"/>
                 <w:color w:val="000000"/>
                 <w:sz w:val="20"/>
                 <w:szCs w:val="20"/>
@@ -11538,7 +10973,6 @@
             <w:pPr>
               <w:spacing w:after="0" w:line="240" w:lineRule="auto"/>
               <w:rPr>
-                <w:rFonts w:ascii="Calibri" w:cs="Calibri" w:eastAsia="Calibri" w:hAnsi="Calibri"/>
                 <w:color w:val="000000"/>
                 <w:sz w:val="20"/>
                 <w:szCs w:val="20"/>
@@ -11636,7 +11070,6 @@
             <w:pPr>
               <w:spacing w:after="0" w:line="240" w:lineRule="auto"/>
               <w:rPr>
-                <w:rFonts w:ascii="Calibri" w:cs="Calibri" w:eastAsia="Calibri" w:hAnsi="Calibri"/>
                 <w:color w:val="000000"/>
                 <w:sz w:val="20"/>
                 <w:szCs w:val="20"/>
@@ -11805,6 +11238,97 @@
           </w:p>
         </w:tc>
       </w:tr>
+      <w:tr>
+        <w:trPr>
+          <w:cantSplit w:val="0"/>
+          <w:trHeight w:val="278" w:hRule="atLeast"/>
+          <w:tblHeader w:val="0"/>
+        </w:trPr>
+        <w:tc>
+          <w:tcPr>
+            <w:tcBorders>
+              <w:top w:color="000000" w:space="0" w:sz="0" w:val="nil"/>
+              <w:left w:color="000000" w:space="0" w:sz="4" w:val="single"/>
+              <w:bottom w:color="000000" w:space="0" w:sz="4" w:val="single"/>
+              <w:right w:color="000000" w:space="0" w:sz="4" w:val="single"/>
+            </w:tcBorders>
+            <w:shd w:fill="auto" w:val="clear"/>
+          </w:tcPr>
+          <w:p>
+            <w:pPr>
+              <w:spacing w:after="0" w:line="240" w:lineRule="auto"/>
+              <w:rPr>
+                <w:sz w:val="20"/>
+                <w:szCs w:val="20"/>
+              </w:rPr>
+            </w:pPr>
+            <w:r>
+              <w:rPr>
+                <w:sz w:val="20"/>
+                <w:szCs w:val="20"/>
+                <w:rtl w:val="0"/>
+              </w:rPr>
+              <w:t xml:space="preserve">LI-07</w:t>
+            </w:r>
+          </w:p>
+        </w:tc>
+        <w:tc>
+          <w:tcPr>
+            <w:tcBorders>
+              <w:top w:color="000000" w:space="0" w:sz="0" w:val="nil"/>
+              <w:left w:color="000000" w:space="0" w:sz="0" w:val="nil"/>
+              <w:bottom w:color="000000" w:space="0" w:sz="4" w:val="single"/>
+              <w:right w:color="000000" w:space="0" w:sz="4" w:val="single"/>
+            </w:tcBorders>
+            <w:shd w:fill="auto" w:val="clear"/>
+          </w:tcPr>
+          <w:p>
+            <w:pPr>
+              <w:spacing w:after="0" w:line="240" w:lineRule="auto"/>
+              <w:rPr>
+                <w:sz w:val="20"/>
+                <w:szCs w:val="20"/>
+              </w:rPr>
+            </w:pPr>
+            <w:r>
+              <w:rPr>
+                <w:sz w:val="20"/>
+                <w:szCs w:val="20"/>
+                <w:rtl w:val="0"/>
+              </w:rPr>
+              <w:t xml:space="preserve">Tax invoice issuance and delivery </w:t>
+            </w:r>
+          </w:p>
+        </w:tc>
+        <w:tc>
+          <w:tcPr>
+            <w:tcBorders>
+              <w:top w:color="000000" w:space="0" w:sz="0" w:val="nil"/>
+              <w:left w:color="000000" w:space="0" w:sz="0" w:val="nil"/>
+              <w:bottom w:color="000000" w:space="0" w:sz="4" w:val="single"/>
+              <w:right w:color="000000" w:space="0" w:sz="4" w:val="single"/>
+            </w:tcBorders>
+            <w:shd w:fill="auto" w:val="clear"/>
+          </w:tcPr>
+          <w:p>
+            <w:pPr>
+              <w:spacing w:after="0" w:line="240" w:lineRule="auto"/>
+              <w:rPr>
+                <w:sz w:val="20"/>
+                <w:szCs w:val="20"/>
+              </w:rPr>
+            </w:pPr>
+            <w:r>
+              <w:rPr>
+                <w:sz w:val="20"/>
+                <w:szCs w:val="20"/>
+                <w:rtl w:val="0"/>
+              </w:rPr>
+              <w:t xml:space="preserve">GCMB records tax invoice needs and handling progress only. Requests are communicated to the tax accountant outside GCMB, and invoice issuance and delivery are handled outside the system without integration with tax accounting software </w:t>
+            </w:r>
+          </w:p>
+        </w:tc>
+      </w:tr>
     </w:tbl>
     <w:p>
       <w:pPr>
@@ -11822,8 +11346,8 @@
         <w:pStyle w:val="Heading1"/>
         <w:rPr/>
       </w:pPr>
-      <w:bookmarkStart w:colFirst="0" w:colLast="0" w:name="_heading=h.k0ltbklk8lo5" w:id="26"/>
-      <w:bookmarkEnd w:id="26"/>
+      <w:bookmarkStart w:colFirst="0" w:colLast="0" w:name="_heading=h.k0ltbklk8lo5" w:id="23"/>
+      <w:bookmarkEnd w:id="23"/>
       <w:r>
         <w:rPr>
           <w:rtl w:val="0"/>
@@ -11835,8 +11359,8 @@
         <w:pStyle w:val="Heading1"/>
         <w:rPr/>
       </w:pPr>
-      <w:bookmarkStart w:colFirst="0" w:colLast="0" w:name="_heading=h.mumd94r6jvgt" w:id="27"/>
-      <w:bookmarkEnd w:id="27"/>
+      <w:bookmarkStart w:colFirst="0" w:colLast="0" w:name="_heading=h.mumd94r6jvgt" w:id="24"/>
+      <w:bookmarkEnd w:id="24"/>
       <w:r>
         <w:rPr>
           <w:rtl w:val="0"/>
@@ -11848,8 +11372,8 @@
         <w:pStyle w:val="Heading1"/>
         <w:rPr/>
       </w:pPr>
-      <w:bookmarkStart w:colFirst="0" w:colLast="0" w:name="_heading=h.ohw3euqnjxvy" w:id="28"/>
-      <w:bookmarkEnd w:id="28"/>
+      <w:bookmarkStart w:colFirst="0" w:colLast="0" w:name="_heading=h.ohw3euqnjxvy" w:id="25"/>
+      <w:bookmarkEnd w:id="25"/>
       <w:r>
         <w:rPr>
           <w:rtl w:val="0"/>
@@ -11861,8 +11385,8 @@
         <w:pStyle w:val="Heading1"/>
         <w:rPr/>
       </w:pPr>
-      <w:bookmarkStart w:colFirst="0" w:colLast="0" w:name="_heading=h.267vfp3tk11q" w:id="29"/>
-      <w:bookmarkEnd w:id="29"/>
+      <w:bookmarkStart w:colFirst="0" w:colLast="0" w:name="_heading=h.267vfp3tk11q" w:id="26"/>
+      <w:bookmarkEnd w:id="26"/>
       <w:r>
         <w:rPr>
           <w:rtl w:val="0"/>
@@ -11874,8 +11398,8 @@
         <w:pStyle w:val="Heading1"/>
         <w:rPr/>
       </w:pPr>
-      <w:bookmarkStart w:colFirst="0" w:colLast="0" w:name="_heading=h.r067dzkbkwwa" w:id="30"/>
-      <w:bookmarkEnd w:id="30"/>
+      <w:bookmarkStart w:colFirst="0" w:colLast="0" w:name="_heading=h.r067dzkbkwwa" w:id="27"/>
+      <w:bookmarkEnd w:id="27"/>
       <w:r>
         <w:rPr>
           <w:rtl w:val="0"/>
@@ -11891,8 +11415,8 @@
           <w:color w:val="0000ff"/>
         </w:rPr>
       </w:pPr>
-      <w:bookmarkStart w:colFirst="0" w:colLast="0" w:name="_heading=h.q2vj5nuojq0e" w:id="31"/>
-      <w:bookmarkEnd w:id="31"/>
+      <w:bookmarkStart w:colFirst="0" w:colLast="0" w:name="_heading=h.q2vj5nuojq0e" w:id="28"/>
+      <w:bookmarkEnd w:id="28"/>
       <w:r>
         <w:rPr>
           <w:rtl w:val="0"/>
@@ -12668,8 +12192,8 @@
         <w:pStyle w:val="Heading1"/>
         <w:rPr/>
       </w:pPr>
-      <w:bookmarkStart w:colFirst="0" w:colLast="0" w:name="_heading=h.nrd3g5gt26xm" w:id="32"/>
-      <w:bookmarkEnd w:id="32"/>
+      <w:bookmarkStart w:colFirst="0" w:colLast="0" w:name="_heading=h.nrd3g5gt26xm" w:id="29"/>
+      <w:bookmarkEnd w:id="29"/>
       <w:r>
         <w:rPr>
           <w:rtl w:val="0"/>
@@ -14348,7 +13872,7 @@
 
 <file path=customXML/item1.xml><?xml version="1.0" encoding="utf-8"?>
 <go:gDocsCustomXmlDataStorage xmlns:go="http://customooxmlschemas.google.com/" xmlns:r="http://schemas.openxmlformats.org/officeDocument/2006/relationships" uri="GoogleDocsCustomDataVersion2">
-  <go:docsCustomData xmlns:go="http://customooxmlschemas.google.com/" roundtripDataSignature="AMtx7miROovIUp/gYu1pTEI6mUgaUA5GbQ==">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</go:docsCustomData>
+  <go:docsCustomData xmlns:go="http://customooxmlschemas.google.com/" roundtripDataSignature="AMtx7mg+Il6Pf1RKhU4JecsGqSO6vZ4rrg==">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</go:docsCustomData>
 </go:gDocsCustomXmlDataStorage>
 </file>
 

</xml_diff>